<commit_message>
4 maret 2026 -
</commit_message>
<xml_diff>
--- a/SPM/laporan SPM.docx
+++ b/SPM/laporan SPM.docx
@@ -2829,52 +2829,32 @@
       <w:r>
         <w:t xml:space="preserve">Tabel </w:t>
       </w:r>
-      <w:r>
-        <w:fldChar w:fldCharType="begin"/>
-      </w:r>
-      <w:r>
-        <w:instrText xml:space="preserve"> STYLEREF 1 \s </w:instrText>
-      </w:r>
-      <w:r>
-        <w:fldChar w:fldCharType="separate"/>
-      </w:r>
-      <w:r>
-        <w:rPr>
-          <w:noProof/>
-          <w:cs/>
-        </w:rPr>
-        <w:t>‎</w:t>
-      </w:r>
-      <w:r>
-        <w:rPr>
-          <w:noProof/>
-        </w:rPr>
-        <w:t>I</w:t>
-      </w:r>
-      <w:r>
-        <w:fldChar w:fldCharType="end"/>
-      </w:r>
+      <w:fldSimple w:instr=" STYLEREF 1 \s ">
+        <w:r>
+          <w:rPr>
+            <w:noProof/>
+            <w:cs/>
+          </w:rPr>
+          <w:t>‎</w:t>
+        </w:r>
+        <w:r>
+          <w:rPr>
+            <w:noProof/>
+          </w:rPr>
+          <w:t>I</w:t>
+        </w:r>
+      </w:fldSimple>
       <w:r>
         <w:t>.</w:t>
       </w:r>
-      <w:r>
-        <w:fldChar w:fldCharType="begin"/>
-      </w:r>
-      <w:r>
-        <w:instrText xml:space="preserve"> SEQ Tabel \* ROMAN \s 1 </w:instrText>
-      </w:r>
-      <w:r>
-        <w:fldChar w:fldCharType="separate"/>
-      </w:r>
-      <w:r>
-        <w:rPr>
-          <w:noProof/>
-        </w:rPr>
-        <w:t>I</w:t>
-      </w:r>
-      <w:r>
-        <w:fldChar w:fldCharType="end"/>
-      </w:r>
+      <w:fldSimple w:instr=" SEQ Tabel \* ROMAN \s 1 ">
+        <w:r>
+          <w:rPr>
+            <w:noProof/>
+          </w:rPr>
+          <w:t>I</w:t>
+        </w:r>
+      </w:fldSimple>
       <w:r>
         <w:t xml:space="preserve">. </w:t>
       </w:r>
@@ -4141,14 +4121,7 @@
           <w:rFonts w:cs="Times New Roman"/>
           <w:shd w:val="clear" w:color="auto" w:fill="FFFFFF"/>
         </w:rPr>
-        <w:t>Standar Pelayanan Minimal</w:t>
-      </w:r>
-      <w:r>
-        <w:rPr>
-          <w:rFonts w:cs="Times New Roman"/>
-          <w:shd w:val="clear" w:color="auto" w:fill="FFFFFF"/>
-        </w:rPr>
-        <w:t> </w:t>
+        <w:t>Standar Pelayanan Minimal </w:t>
       </w:r>
       <w:r>
         <w:rPr>
@@ -4744,15 +4717,7 @@
           <w:b/>
           <w:shd w:val="clear" w:color="auto" w:fill="FFFFFF"/>
         </w:rPr>
-        <w:t>Permendagri Nomor 114 Tahun 2018</w:t>
-      </w:r>
-      <w:r>
-        <w:rPr>
-          <w:rFonts w:cs="Times New Roman"/>
-          <w:b/>
-          <w:shd w:val="clear" w:color="auto" w:fill="FFFFFF"/>
-        </w:rPr>
-        <w:t xml:space="preserve"> </w:t>
+        <w:t xml:space="preserve">Permendagri Nomor 114 Tahun 2018 </w:t>
       </w:r>
       <w:r>
         <w:rPr>
@@ -6836,14 +6801,237 @@
     </w:p>
     <w:p>
       <w:pPr>
-        <w:jc w:val="both"/>
+        <w:pStyle w:val="ListParagraph"/>
+        <w:ind w:left="900"/>
+        <w:jc w:val="both"/>
+        <w:rPr>
+          <w:b/>
+        </w:rPr>
+      </w:pPr>
+      <w:r>
+        <w:rPr>
+          <w:rFonts w:cs="Times New Roman"/>
+        </w:rPr>
+        <w:t>Peraturan yang berlaku mulai 13 Juni 2022 ini menjadi acuan pemerintah daerah untuk menyusun dokumen perencanaan tahunan, mencakup prioritas pembangunan, target pertumbuhan ekonomi, dan pemulihan ekonomi pasca-pandemi, diundangkan oleh </w:t>
+      </w:r>
+      <w:r>
+        <w:rPr>
+          <w:rFonts w:cs="Times New Roman"/>
+          <w:shd w:val="clear" w:color="auto" w:fill="FFFFFF"/>
+        </w:rPr>
+        <w:t>BPK RI</w:t>
+      </w:r>
+      <w:r>
+        <w:rPr>
+          <w:rFonts w:cs="Times New Roman"/>
+          <w:color w:val="0A0A0A"/>
+          <w:shd w:val="clear" w:color="auto" w:fill="FFFFFF"/>
+        </w:rPr>
+        <w:t xml:space="preserve"> dengan penjelasan sebagaimana sibawah </w:t>
+      </w:r>
+      <w:proofErr w:type="gramStart"/>
+      <w:r>
+        <w:rPr>
+          <w:rFonts w:cs="Times New Roman"/>
+          <w:color w:val="0A0A0A"/>
+          <w:shd w:val="clear" w:color="auto" w:fill="FFFFFF"/>
+        </w:rPr>
+        <w:t>ini;</w:t>
+      </w:r>
+      <w:proofErr w:type="gramEnd"/>
+    </w:p>
+    <w:p>
+      <w:pPr>
+        <w:pStyle w:val="ListParagraph"/>
+        <w:numPr>
+          <w:ilvl w:val="0"/>
+          <w:numId w:val="50"/>
+        </w:numPr>
+        <w:shd w:val="clear" w:color="auto" w:fill="FFFFFF"/>
+        <w:spacing w:after="180"/>
+        <w:ind w:left="1260"/>
+        <w:jc w:val="both"/>
+        <w:rPr>
+          <w:rFonts w:cs="Times New Roman"/>
+          <w:color w:val="0A0A0A"/>
+        </w:rPr>
+      </w:pPr>
+      <w:r>
+        <w:rPr>
+          <w:rStyle w:val="Strong"/>
+          <w:rFonts w:cs="Times New Roman"/>
+          <w:color w:val="0A0A0A"/>
+        </w:rPr>
+        <w:t>Fungsi Utama:</w:t>
+      </w:r>
+      <w:r>
+        <w:rPr>
+          <w:rStyle w:val="t286pc"/>
+          <w:rFonts w:cs="Times New Roman"/>
+          <w:color w:val="0A0A0A"/>
+        </w:rPr>
+        <w:t> Sebagai panduan komprehensif bagi Pemerintah Daerah (Provinsi maupun Kabupaten/Kota) dalam merumuskan RKPD tahun 2023, yang merupakan penjabaran dari RPJMD (Rencana Pembangunan Jangka Menengah Daerah).</w:t>
+      </w:r>
+    </w:p>
+    <w:p>
+      <w:pPr>
+        <w:pStyle w:val="ListParagraph"/>
+        <w:numPr>
+          <w:ilvl w:val="0"/>
+          <w:numId w:val="50"/>
+        </w:numPr>
+        <w:shd w:val="clear" w:color="auto" w:fill="FFFFFF"/>
+        <w:spacing w:after="180"/>
+        <w:ind w:left="1260"/>
+        <w:jc w:val="both"/>
+        <w:rPr>
+          <w:rFonts w:cs="Times New Roman"/>
+          <w:color w:val="0A0A0A"/>
+        </w:rPr>
+      </w:pPr>
+      <w:r>
+        <w:rPr>
+          <w:rStyle w:val="Strong"/>
+          <w:rFonts w:cs="Times New Roman"/>
+          <w:color w:val="0A0A0A"/>
+        </w:rPr>
+        <w:t>Isi RKPD 2023:</w:t>
+      </w:r>
+      <w:r>
+        <w:rPr>
+          <w:rStyle w:val="t286pc"/>
+          <w:rFonts w:cs="Times New Roman"/>
+          <w:color w:val="0A0A0A"/>
+        </w:rPr>
+        <w:t> Dokumen ini memuat kerangka ekonomi daerah, prioritas pembangunan, rencana kerja dan pendanaan, serta kebijakan pemulihan ekonomi dampak pandemi COVID-19, </w:t>
+      </w:r>
+    </w:p>
+    <w:p>
+      <w:pPr>
+        <w:pStyle w:val="ListParagraph"/>
+        <w:numPr>
+          <w:ilvl w:val="0"/>
+          <w:numId w:val="50"/>
+        </w:numPr>
+        <w:shd w:val="clear" w:color="auto" w:fill="FFFFFF"/>
+        <w:spacing w:after="180"/>
+        <w:ind w:left="1260"/>
+        <w:jc w:val="both"/>
+        <w:rPr>
+          <w:rFonts w:cs="Times New Roman"/>
+          <w:color w:val="0A0A0A"/>
+        </w:rPr>
+      </w:pPr>
+      <w:r>
+        <w:rPr>
+          <w:rStyle w:val="Strong"/>
+          <w:rFonts w:cs="Times New Roman"/>
+          <w:color w:val="0A0A0A"/>
+        </w:rPr>
+        <w:lastRenderedPageBreak/>
+        <w:t>Sasaran Pembangunan (2023):</w:t>
+      </w:r>
+      <w:r>
+        <w:rPr>
+          <w:rStyle w:val="t286pc"/>
+          <w:rFonts w:cs="Times New Roman"/>
+          <w:color w:val="0A0A0A"/>
+        </w:rPr>
+        <w:t> Mendukung sasaran nasional seperti pertumbuhan ekonomi 5,3%-5,9%, penurunan emisi gas rumah kaca, penurunan tingkat pengangguran terbuka, peningkatan indeks pembangunan manusia (IPM), dan penurunan angka kemiskinan, </w:t>
+      </w:r>
+    </w:p>
+    <w:p>
+      <w:pPr>
+        <w:pStyle w:val="ListParagraph"/>
+        <w:numPr>
+          <w:ilvl w:val="0"/>
+          <w:numId w:val="50"/>
+        </w:numPr>
+        <w:shd w:val="clear" w:color="auto" w:fill="FFFFFF"/>
+        <w:spacing w:after="180"/>
+        <w:ind w:left="1260"/>
+        <w:jc w:val="both"/>
+        <w:rPr>
+          <w:rStyle w:val="t286pc"/>
+          <w:rFonts w:cs="Times New Roman"/>
+          <w:color w:val="0A0A0A"/>
+        </w:rPr>
+      </w:pPr>
+      <w:r>
+        <w:rPr>
+          <w:rStyle w:val="Strong"/>
+          <w:rFonts w:cs="Times New Roman"/>
+          <w:color w:val="0A0A0A"/>
+        </w:rPr>
+        <w:t>Fokus Pembangunan:</w:t>
+      </w:r>
+      <w:r>
+        <w:rPr>
+          <w:rStyle w:val="t286pc"/>
+          <w:rFonts w:cs="Times New Roman"/>
+          <w:color w:val="0A0A0A"/>
+        </w:rPr>
+        <w:t> Mendukung </w:t>
+      </w:r>
+      <w:r>
         <w:rPr>
           <w:rStyle w:val="Emphasis"/>
-          <w:b/>
+          <w:rFonts w:cs="Times New Roman"/>
+          <w:color w:val="0A0A0A"/>
+        </w:rPr>
+        <w:t>Major Project</w:t>
+      </w:r>
+      <w:r>
+        <w:rPr>
+          <w:rStyle w:val="t286pc"/>
+          <w:rFonts w:cs="Times New Roman"/>
+          <w:color w:val="0A0A0A"/>
+        </w:rPr>
+        <w:t> (MP) nasional, termasuk reformasi sistem kesehatan, transformasi digital, jaringan pelabuhan, pembangunan Ibu Kota Nusantara (IKN), serta peningkatan ketahanan pangan, menurut dokumen BPK RI dan </w:t>
+      </w:r>
+    </w:p>
+    <w:p>
+      <w:pPr>
+        <w:pStyle w:val="ListParagraph"/>
+        <w:numPr>
+          <w:ilvl w:val="0"/>
+          <w:numId w:val="50"/>
+        </w:numPr>
+        <w:shd w:val="clear" w:color="auto" w:fill="FFFFFF"/>
+        <w:ind w:left="1260"/>
+        <w:contextualSpacing w:val="0"/>
+        <w:jc w:val="both"/>
+        <w:rPr>
+          <w:rStyle w:val="Emphasis"/>
+          <w:rFonts w:cs="Times New Roman"/>
           <w:i w:val="0"/>
           <w:iCs w:val="0"/>
-        </w:rPr>
-      </w:pPr>
+          <w:color w:val="0A0A0A"/>
+        </w:rPr>
+      </w:pPr>
+      <w:r>
+        <w:rPr>
+          <w:rStyle w:val="Strong"/>
+          <w:rFonts w:cs="Times New Roman"/>
+          <w:color w:val="0A0A0A"/>
+        </w:rPr>
+        <w:t>Prinsip Penyusunan:</w:t>
+      </w:r>
+      <w:r>
+        <w:rPr>
+          <w:rStyle w:val="t286pc"/>
+          <w:rFonts w:cs="Times New Roman"/>
+          <w:color w:val="0A0A0A"/>
+        </w:rPr>
+        <w:t> Harus berdasarkan kebutuhan daerah, tepat waktu, partisipatif, transparan, dan taat peraturan, dengan memprioritaskan pemenuhan pelayanan dasar dan belanja wajib.</w:t>
+      </w:r>
+      <w:r>
+        <w:rPr>
+          <w:rFonts w:cs="Times New Roman"/>
+          <w:color w:val="0A0A0A"/>
+        </w:rPr>
+        <w:t xml:space="preserve"> </w:t>
+      </w:r>
     </w:p>
     <w:p>
       <w:pPr>
@@ -6885,11 +7073,142 @@
     </w:p>
     <w:p>
       <w:pPr>
-        <w:jc w:val="both"/>
-        <w:rPr>
-          <w:b/>
-        </w:rPr>
-      </w:pPr>
+        <w:pStyle w:val="ListParagraph"/>
+        <w:ind w:left="900"/>
+        <w:jc w:val="both"/>
+        <w:rPr>
+          <w:b/>
+        </w:rPr>
+      </w:pPr>
+      <w:r>
+        <w:rPr>
+          <w:rFonts w:eastAsia="Times New Roman" w:cs="Times New Roman"/>
+          <w:color w:val="0A0A0A"/>
+        </w:rPr>
+        <w:t>Peraturan terbaru yang menetapkan standar teknis SPM untuk bidang Pekerjaan Umum dan Perumahan Rakyat, mencakup indikator seperti penyediaan air minum, pengolahan air limbah domestik, penyediaan rumah layak huni, pengelolaan sampah, drainase lingkungan, dan pengelolaan Ruang Terbuka Hijau (RTH)</w:t>
+      </w:r>
+    </w:p>
+    <w:p>
+      <w:pPr>
+        <w:numPr>
+          <w:ilvl w:val="0"/>
+          <w:numId w:val="52"/>
+        </w:numPr>
+        <w:shd w:val="clear" w:color="auto" w:fill="FFFFFF"/>
+        <w:spacing w:after="0"/>
+        <w:jc w:val="both"/>
+        <w:rPr>
+          <w:rFonts w:eastAsia="Times New Roman" w:cs="Times New Roman"/>
+          <w:color w:val="0A0A0A"/>
+        </w:rPr>
+      </w:pPr>
+      <w:r>
+        <w:rPr>
+          <w:rFonts w:eastAsia="Times New Roman" w:cs="Times New Roman"/>
+          <w:b/>
+          <w:bCs/>
+          <w:color w:val="0A0A0A"/>
+        </w:rPr>
+        <w:t>Tujuan:</w:t>
+      </w:r>
+      <w:r>
+        <w:rPr>
+          <w:rFonts w:eastAsia="Times New Roman" w:cs="Times New Roman"/>
+          <w:color w:val="0A0A0A"/>
+        </w:rPr>
+        <w:t> Memberikan pemahaman dan acuan teknis kepada pemda terkait pendataan, perencanaan, pelaksanaan, dan pengawasan pemenuhan layanan dasar.</w:t>
+      </w:r>
+    </w:p>
+    <w:p>
+      <w:pPr>
+        <w:numPr>
+          <w:ilvl w:val="0"/>
+          <w:numId w:val="52"/>
+        </w:numPr>
+        <w:shd w:val="clear" w:color="auto" w:fill="FFFFFF"/>
+        <w:spacing w:after="0"/>
+        <w:jc w:val="both"/>
+        <w:rPr>
+          <w:rFonts w:eastAsia="Times New Roman" w:cs="Times New Roman"/>
+          <w:color w:val="0A0A0A"/>
+        </w:rPr>
+      </w:pPr>
+      <w:r>
+        <w:rPr>
+          <w:rFonts w:eastAsia="Times New Roman" w:cs="Times New Roman"/>
+          <w:b/>
+          <w:bCs/>
+          <w:color w:val="0A0A0A"/>
+        </w:rPr>
+        <w:t>Lingkup SPM:</w:t>
+      </w:r>
+      <w:r>
+        <w:rPr>
+          <w:rFonts w:eastAsia="Times New Roman" w:cs="Times New Roman"/>
+          <w:color w:val="0A0A0A"/>
+        </w:rPr>
+        <w:t> Fokus pada pemenuhan layanan dasar air minum, air limbah domestik, dan rumah layak huni (termasuk rumah bencana dan relokasi).</w:t>
+      </w:r>
+    </w:p>
+    <w:p>
+      <w:pPr>
+        <w:numPr>
+          <w:ilvl w:val="0"/>
+          <w:numId w:val="52"/>
+        </w:numPr>
+        <w:shd w:val="clear" w:color="auto" w:fill="FFFFFF"/>
+        <w:spacing w:after="0"/>
+        <w:jc w:val="both"/>
+        <w:rPr>
+          <w:rFonts w:eastAsia="Times New Roman" w:cs="Times New Roman"/>
+          <w:color w:val="0A0A0A"/>
+        </w:rPr>
+      </w:pPr>
+      <w:r>
+        <w:rPr>
+          <w:rFonts w:eastAsia="Times New Roman" w:cs="Times New Roman"/>
+          <w:b/>
+          <w:bCs/>
+          <w:color w:val="0A0A0A"/>
+        </w:rPr>
+        <w:t>Kuantitas Layanan:</w:t>
+      </w:r>
+      <w:r>
+        <w:rPr>
+          <w:rFonts w:eastAsia="Times New Roman" w:cs="Times New Roman"/>
+          <w:color w:val="0A0A0A"/>
+        </w:rPr>
+        <w:t> Mengatur standar pelayanan, contohnya kebutuhan air minum sebesar 60 liter/orang/hari melalui SPAM.</w:t>
+      </w:r>
+    </w:p>
+    <w:p>
+      <w:pPr>
+        <w:pStyle w:val="ListParagraph"/>
+        <w:numPr>
+          <w:ilvl w:val="0"/>
+          <w:numId w:val="52"/>
+        </w:numPr>
+        <w:jc w:val="both"/>
+        <w:rPr>
+          <w:b/>
+        </w:rPr>
+      </w:pPr>
+      <w:r>
+        <w:rPr>
+          <w:rFonts w:eastAsia="Times New Roman" w:cs="Times New Roman"/>
+          <w:b/>
+          <w:bCs/>
+          <w:color w:val="0A0A0A"/>
+        </w:rPr>
+        <w:t>Penerapan Berbasis Elektronik:</w:t>
+      </w:r>
+      <w:r>
+        <w:rPr>
+          <w:rFonts w:eastAsia="Times New Roman" w:cs="Times New Roman"/>
+          <w:color w:val="0A0A0A"/>
+        </w:rPr>
+        <w:t> Menggunakan metode pelaporan secara elektronik dan satu data Kementerian PUPR.</w:t>
+      </w:r>
     </w:p>
     <w:p>
       <w:pPr>
@@ -6940,13 +7259,408 @@
     </w:p>
     <w:p>
       <w:pPr>
-        <w:jc w:val="both"/>
-      </w:pPr>
-    </w:p>
-    <w:p>
-      <w:pPr>
-        <w:jc w:val="both"/>
-      </w:pPr>
+        <w:pStyle w:val="ListParagraph"/>
+        <w:ind w:left="900"/>
+        <w:jc w:val="both"/>
+        <w:rPr>
+          <w:rFonts w:eastAsia="Times New Roman" w:cs="Times New Roman"/>
+          <w:color w:val="0A0A0A"/>
+        </w:rPr>
+      </w:pPr>
+      <w:r>
+        <w:rPr>
+          <w:rFonts w:cs="Times New Roman"/>
+        </w:rPr>
+        <w:t>M</w:t>
+      </w:r>
+      <w:r>
+        <w:rPr>
+          <w:rFonts w:cs="Times New Roman"/>
+        </w:rPr>
+        <w:t>engatur pedoman teknis bagi pemerintah daerah dalam memberikan 12 jenis pelayanan dasar kesehatan wajib</w:t>
+      </w:r>
+      <w:r>
+        <w:rPr>
+          <w:rFonts w:cs="Times New Roman"/>
+          <w:color w:val="0A0A0A"/>
+          <w:shd w:val="clear" w:color="auto" w:fill="FFFFFF"/>
+        </w:rPr>
+        <w:t>. Peraturan ini diterbitkan pada 16 April 2024 juga m</w:t>
+      </w:r>
+      <w:r>
+        <w:rPr>
+          <w:rFonts w:eastAsia="Times New Roman" w:cs="Times New Roman"/>
+          <w:color w:val="0A0A0A"/>
+        </w:rPr>
+        <w:t xml:space="preserve">engatur standar teknis spesifik untuk pelayanan dasar kesehatan (jenis dan mutu) yang wajib dipenuhi Pemda Provinsi/Kabupaten/Kota, mencakup pelayanan antenatal (K4), persalinan, bayi baru lahir, balita, usia sekolah, produktif, lansia, penderita Hipertensi &amp; DM, gizi buruk, dan pencegahan penyakit. Dengan uraian sebagai </w:t>
+      </w:r>
+      <w:proofErr w:type="gramStart"/>
+      <w:r>
+        <w:rPr>
+          <w:rFonts w:eastAsia="Times New Roman" w:cs="Times New Roman"/>
+          <w:color w:val="0A0A0A"/>
+        </w:rPr>
+        <w:t>berikut;</w:t>
+      </w:r>
+      <w:proofErr w:type="gramEnd"/>
+    </w:p>
+    <w:p>
+      <w:pPr>
+        <w:pStyle w:val="ListParagraph"/>
+        <w:numPr>
+          <w:ilvl w:val="0"/>
+          <w:numId w:val="61"/>
+        </w:numPr>
+        <w:jc w:val="both"/>
+        <w:rPr>
+          <w:b/>
+        </w:rPr>
+      </w:pPr>
+      <w:r>
+        <w:rPr>
+          <w:rFonts w:eastAsia="Times New Roman" w:cs="Times New Roman"/>
+          <w:b/>
+          <w:bCs/>
+          <w:color w:val="0A0A0A"/>
+        </w:rPr>
+        <w:t>Tujuan dan Ruang Lingkup</w:t>
+      </w:r>
+    </w:p>
+    <w:p>
+      <w:pPr>
+        <w:pStyle w:val="ListParagraph"/>
+        <w:numPr>
+          <w:ilvl w:val="0"/>
+          <w:numId w:val="58"/>
+        </w:numPr>
+        <w:shd w:val="clear" w:color="auto" w:fill="FFFFFF"/>
+        <w:spacing w:after="180"/>
+        <w:jc w:val="both"/>
+        <w:rPr>
+          <w:rFonts w:eastAsia="Times New Roman" w:cs="Times New Roman"/>
+          <w:color w:val="0A0A0A"/>
+        </w:rPr>
+      </w:pPr>
+      <w:r>
+        <w:rPr>
+          <w:rFonts w:eastAsia="Times New Roman" w:cs="Times New Roman"/>
+          <w:b/>
+          <w:bCs/>
+          <w:color w:val="0A0A0A"/>
+        </w:rPr>
+        <w:t>Standar Teknis:</w:t>
+      </w:r>
+      <w:r>
+        <w:rPr>
+          <w:rFonts w:eastAsia="Times New Roman" w:cs="Times New Roman"/>
+          <w:color w:val="0A0A0A"/>
+        </w:rPr>
+        <w:t> Menetapkan pedoman jenis, mutu, dan penerima layanan kesehatan dasar.</w:t>
+      </w:r>
+    </w:p>
+    <w:p>
+      <w:pPr>
+        <w:pStyle w:val="ListParagraph"/>
+        <w:numPr>
+          <w:ilvl w:val="0"/>
+          <w:numId w:val="58"/>
+        </w:numPr>
+        <w:shd w:val="clear" w:color="auto" w:fill="FFFFFF"/>
+        <w:spacing w:after="180"/>
+        <w:jc w:val="both"/>
+        <w:rPr>
+          <w:rFonts w:eastAsia="Times New Roman" w:cs="Times New Roman"/>
+          <w:color w:val="0A0A0A"/>
+        </w:rPr>
+      </w:pPr>
+      <w:r>
+        <w:rPr>
+          <w:rFonts w:eastAsia="Times New Roman" w:cs="Times New Roman"/>
+          <w:b/>
+          <w:bCs/>
+          <w:color w:val="0A0A0A"/>
+        </w:rPr>
+        <w:t>Pembaruan Standar:</w:t>
+      </w:r>
+      <w:r>
+        <w:rPr>
+          <w:rFonts w:eastAsia="Times New Roman" w:cs="Times New Roman"/>
+          <w:color w:val="0A0A0A"/>
+        </w:rPr>
+        <w:t> Memperbarui standar pelayanan teknis seiring dengan transformasi kesehatan untuk memastikan kualitas layanan di Puskesmas dan faskes lainnya.</w:t>
+      </w:r>
+    </w:p>
+    <w:p>
+      <w:pPr>
+        <w:pStyle w:val="ListParagraph"/>
+        <w:numPr>
+          <w:ilvl w:val="0"/>
+          <w:numId w:val="58"/>
+        </w:numPr>
+        <w:shd w:val="clear" w:color="auto" w:fill="FFFFFF"/>
+        <w:contextualSpacing w:val="0"/>
+        <w:jc w:val="both"/>
+        <w:rPr>
+          <w:rFonts w:eastAsia="Times New Roman" w:cs="Times New Roman"/>
+        </w:rPr>
+      </w:pPr>
+      <w:r>
+        <w:rPr>
+          <w:rFonts w:eastAsia="Times New Roman" w:cs="Times New Roman"/>
+          <w:b/>
+          <w:bCs/>
+          <w:color w:val="0A0A0A"/>
+        </w:rPr>
+        <w:t>Pencabutan PMK 4/2019:</w:t>
+      </w:r>
+      <w:r>
+        <w:rPr>
+          <w:rFonts w:eastAsia="Times New Roman" w:cs="Times New Roman"/>
+          <w:color w:val="0A0A0A"/>
+        </w:rPr>
+        <w:t> Dengan berlakunya peraturan ini, PMK No. 4 Tahun 2019 tentang Standar Teknis Pemenuhan Mutu Pelayanan Dasar pada SPM Kesehatan dinyatakan tidak berlaku. </w:t>
+      </w:r>
+    </w:p>
+    <w:p>
+      <w:pPr>
+        <w:pStyle w:val="ListParagraph"/>
+        <w:numPr>
+          <w:ilvl w:val="0"/>
+          <w:numId w:val="61"/>
+        </w:numPr>
+        <w:shd w:val="clear" w:color="auto" w:fill="FFFFFF"/>
+        <w:spacing w:after="0"/>
+        <w:jc w:val="both"/>
+        <w:rPr>
+          <w:rFonts w:eastAsia="Times New Roman" w:cs="Times New Roman"/>
+          <w:color w:val="0A0A0A"/>
+        </w:rPr>
+      </w:pPr>
+      <w:r>
+        <w:rPr>
+          <w:rFonts w:eastAsia="Times New Roman" w:cs="Times New Roman"/>
+          <w:b/>
+          <w:bCs/>
+          <w:color w:val="0A0A0A"/>
+        </w:rPr>
+        <w:t>Fokus SPM Kesehatan (12 Pelayanan Dasar)</w:t>
+      </w:r>
+      <w:r>
+        <w:rPr>
+          <w:rFonts w:eastAsia="Times New Roman" w:cs="Times New Roman"/>
+          <w:color w:val="0A0A0A"/>
+        </w:rPr>
+        <w:t xml:space="preserve"> Pemda wajib memenuhi standar pelayanan kesehatan untuk:</w:t>
+      </w:r>
+    </w:p>
+    <w:p>
+      <w:pPr>
+        <w:pStyle w:val="ListParagraph"/>
+        <w:numPr>
+          <w:ilvl w:val="0"/>
+          <w:numId w:val="59"/>
+        </w:numPr>
+        <w:shd w:val="clear" w:color="auto" w:fill="FFFFFF"/>
+        <w:spacing w:after="180"/>
+        <w:jc w:val="both"/>
+        <w:rPr>
+          <w:rFonts w:eastAsia="Times New Roman" w:cs="Times New Roman"/>
+          <w:color w:val="0A0A0A"/>
+        </w:rPr>
+      </w:pPr>
+      <w:r>
+        <w:rPr>
+          <w:rFonts w:eastAsia="Times New Roman" w:cs="Times New Roman"/>
+          <w:color w:val="0A0A0A"/>
+        </w:rPr>
+        <w:t>Pelayanan kesehatan ibu hamil, ibu bersalin, dan bayi baru lahir.</w:t>
+      </w:r>
+    </w:p>
+    <w:p>
+      <w:pPr>
+        <w:pStyle w:val="ListParagraph"/>
+        <w:numPr>
+          <w:ilvl w:val="0"/>
+          <w:numId w:val="59"/>
+        </w:numPr>
+        <w:shd w:val="clear" w:color="auto" w:fill="FFFFFF"/>
+        <w:spacing w:after="180"/>
+        <w:jc w:val="both"/>
+        <w:rPr>
+          <w:rFonts w:eastAsia="Times New Roman" w:cs="Times New Roman"/>
+          <w:color w:val="0A0A0A"/>
+        </w:rPr>
+      </w:pPr>
+      <w:r>
+        <w:rPr>
+          <w:rFonts w:eastAsia="Times New Roman" w:cs="Times New Roman"/>
+          <w:color w:val="0A0A0A"/>
+        </w:rPr>
+        <w:t>Pelayanan kesehatan balita, usia pendidikan dasar, usia produktif (15-59 tahun), dan lansia.</w:t>
+      </w:r>
+    </w:p>
+    <w:p>
+      <w:pPr>
+        <w:pStyle w:val="ListParagraph"/>
+        <w:numPr>
+          <w:ilvl w:val="0"/>
+          <w:numId w:val="59"/>
+        </w:numPr>
+        <w:shd w:val="clear" w:color="auto" w:fill="FFFFFF"/>
+        <w:contextualSpacing w:val="0"/>
+        <w:jc w:val="both"/>
+        <w:rPr>
+          <w:rFonts w:eastAsia="Times New Roman" w:cs="Times New Roman"/>
+        </w:rPr>
+      </w:pPr>
+      <w:r>
+        <w:rPr>
+          <w:rFonts w:eastAsia="Times New Roman" w:cs="Times New Roman"/>
+          <w:color w:val="0A0A0A"/>
+        </w:rPr>
+        <w:t>Pelayanan kesehatan penderita hipertensi, diabetes melitus, gangguan jiwa berat, tuberkulosis, dan orang dengan risiko terinfeksi HIV. </w:t>
+      </w:r>
+    </w:p>
+    <w:p>
+      <w:pPr>
+        <w:shd w:val="clear" w:color="auto" w:fill="FFFFFF"/>
+        <w:jc w:val="both"/>
+        <w:rPr>
+          <w:rFonts w:eastAsia="Times New Roman" w:cs="Times New Roman"/>
+        </w:rPr>
+      </w:pPr>
+    </w:p>
+    <w:p>
+      <w:pPr>
+        <w:shd w:val="clear" w:color="auto" w:fill="FFFFFF"/>
+        <w:jc w:val="both"/>
+        <w:rPr>
+          <w:rFonts w:eastAsia="Times New Roman" w:cs="Times New Roman"/>
+        </w:rPr>
+      </w:pPr>
+    </w:p>
+    <w:p>
+      <w:pPr>
+        <w:pStyle w:val="ListParagraph"/>
+        <w:numPr>
+          <w:ilvl w:val="0"/>
+          <w:numId w:val="61"/>
+        </w:numPr>
+        <w:shd w:val="clear" w:color="auto" w:fill="FFFFFF"/>
+        <w:spacing w:after="0"/>
+        <w:jc w:val="both"/>
+        <w:rPr>
+          <w:rFonts w:eastAsia="Times New Roman" w:cs="Times New Roman"/>
+          <w:color w:val="0A0A0A"/>
+        </w:rPr>
+      </w:pPr>
+      <w:r>
+        <w:rPr>
+          <w:rFonts w:eastAsia="Times New Roman" w:cs="Times New Roman"/>
+          <w:b/>
+          <w:bCs/>
+          <w:color w:val="0A0A0A"/>
+        </w:rPr>
+        <w:lastRenderedPageBreak/>
+        <w:t>Komponen Teknis Pemenuhan</w:t>
+      </w:r>
+    </w:p>
+    <w:p>
+      <w:pPr>
+        <w:pStyle w:val="ListParagraph"/>
+        <w:numPr>
+          <w:ilvl w:val="0"/>
+          <w:numId w:val="60"/>
+        </w:numPr>
+        <w:shd w:val="clear" w:color="auto" w:fill="FFFFFF"/>
+        <w:spacing w:after="180"/>
+        <w:jc w:val="both"/>
+        <w:rPr>
+          <w:rFonts w:eastAsia="Times New Roman" w:cs="Times New Roman"/>
+          <w:color w:val="0A0A0A"/>
+        </w:rPr>
+      </w:pPr>
+      <w:r>
+        <w:rPr>
+          <w:rFonts w:eastAsia="Times New Roman" w:cs="Times New Roman"/>
+          <w:b/>
+          <w:bCs/>
+          <w:color w:val="0A0A0A"/>
+        </w:rPr>
+        <w:t>Edukasi &amp; Skrining:</w:t>
+      </w:r>
+      <w:r>
+        <w:rPr>
+          <w:rFonts w:eastAsia="Times New Roman" w:cs="Times New Roman"/>
+          <w:color w:val="0A0A0A"/>
+        </w:rPr>
+        <w:t> Fokus pada preventif, seperti skrining faktor risiko penyakit menular dan tidak menular, kesehatan reproduksi, serta calon pengantin.</w:t>
+      </w:r>
+    </w:p>
+    <w:p>
+      <w:pPr>
+        <w:pStyle w:val="ListParagraph"/>
+        <w:numPr>
+          <w:ilvl w:val="0"/>
+          <w:numId w:val="60"/>
+        </w:numPr>
+        <w:shd w:val="clear" w:color="auto" w:fill="FFFFFF"/>
+        <w:spacing w:after="180"/>
+        <w:jc w:val="both"/>
+        <w:rPr>
+          <w:rFonts w:eastAsia="Times New Roman" w:cs="Times New Roman"/>
+          <w:color w:val="0A0A0A"/>
+        </w:rPr>
+      </w:pPr>
+      <w:r>
+        <w:rPr>
+          <w:rFonts w:eastAsia="Times New Roman" w:cs="Times New Roman"/>
+          <w:b/>
+          <w:bCs/>
+          <w:color w:val="0A0A0A"/>
+        </w:rPr>
+        <w:t>Mutu Pelayanan:</w:t>
+      </w:r>
+      <w:r>
+        <w:rPr>
+          <w:rFonts w:eastAsia="Times New Roman" w:cs="Times New Roman"/>
+          <w:color w:val="0A0A0A"/>
+        </w:rPr>
+        <w:t> Penyesuaian standar pelayanan mencakup kompetensi tenaga medis, fasilitas pelayanan, dan aksesibilitas bagi warga.</w:t>
+      </w:r>
+    </w:p>
+    <w:p>
+      <w:pPr>
+        <w:pStyle w:val="ListParagraph"/>
+        <w:numPr>
+          <w:ilvl w:val="0"/>
+          <w:numId w:val="60"/>
+        </w:numPr>
+        <w:shd w:val="clear" w:color="auto" w:fill="FFFFFF"/>
+        <w:spacing w:after="180"/>
+        <w:contextualSpacing w:val="0"/>
+        <w:jc w:val="both"/>
+        <w:rPr>
+          <w:rFonts w:eastAsia="Times New Roman" w:cs="Times New Roman"/>
+          <w:color w:val="0A0A0A"/>
+        </w:rPr>
+      </w:pPr>
+      <w:r>
+        <w:rPr>
+          <w:rFonts w:eastAsia="Times New Roman" w:cs="Times New Roman"/>
+          <w:b/>
+          <w:bCs/>
+          <w:color w:val="0A0A0A"/>
+        </w:rPr>
+        <w:t>Evaluasi:</w:t>
+      </w:r>
+      <w:r>
+        <w:rPr>
+          <w:rFonts w:eastAsia="Times New Roman" w:cs="Times New Roman"/>
+          <w:color w:val="0A0A0A"/>
+        </w:rPr>
+        <w:t> Menteri, gubernur, dan bupati/wali kota melakukan pemantauan dan evaluasi berjenjang terhadap pemenuhan standar ini.</w:t>
+      </w:r>
     </w:p>
     <w:p>
       <w:pPr>
@@ -6965,7 +7679,6 @@
           <w:b/>
           <w:bCs/>
         </w:rPr>
-        <w:lastRenderedPageBreak/>
         <w:t>Peraturan Pemerintah Kota Singkawang</w:t>
       </w:r>
     </w:p>
@@ -7046,6 +7759,7 @@
         </w:numPr>
       </w:pPr>
       <w:r>
+        <w:lastRenderedPageBreak/>
         <w:t>Bagi Unit Kerj</w:t>
       </w:r>
       <w:r>
@@ -7094,7 +7808,6 @@
       <w:bookmarkStart w:id="13" w:name="_Toc224130450"/>
       <w:bookmarkStart w:id="14" w:name="_Toc226023010"/>
       <w:r>
-        <w:lastRenderedPageBreak/>
         <w:t>Dasar Hukum</w:t>
       </w:r>
       <w:bookmarkEnd w:id="13"/>
@@ -8380,6 +9093,92 @@
     </w:lvl>
   </w:abstractNum>
   <w:abstractNum w:abstractNumId="3" w15:restartNumberingAfterBreak="0">
+    <w:nsid w:val="03E23428"/>
+    <w:multiLevelType w:val="hybridMultilevel"/>
+    <w:tmpl w:val="17F6C1D6"/>
+    <w:lvl w:ilvl="0" w:tplc="0409001B">
+      <w:start w:val="1"/>
+      <w:numFmt w:val="lowerRoman"/>
+      <w:lvlText w:val="%1."/>
+      <w:lvlJc w:val="right"/>
+      <w:pPr>
+        <w:ind w:left="1800" w:hanging="360"/>
+      </w:pPr>
+    </w:lvl>
+    <w:lvl w:ilvl="1" w:tplc="FFFFFFFF" w:tentative="1">
+      <w:start w:val="1"/>
+      <w:numFmt w:val="lowerLetter"/>
+      <w:lvlText w:val="%2."/>
+      <w:lvlJc w:val="left"/>
+      <w:pPr>
+        <w:ind w:left="2520" w:hanging="360"/>
+      </w:pPr>
+    </w:lvl>
+    <w:lvl w:ilvl="2" w:tplc="FFFFFFFF" w:tentative="1">
+      <w:start w:val="1"/>
+      <w:numFmt w:val="lowerRoman"/>
+      <w:lvlText w:val="%3."/>
+      <w:lvlJc w:val="right"/>
+      <w:pPr>
+        <w:ind w:left="3240" w:hanging="180"/>
+      </w:pPr>
+    </w:lvl>
+    <w:lvl w:ilvl="3" w:tplc="FFFFFFFF" w:tentative="1">
+      <w:start w:val="1"/>
+      <w:numFmt w:val="decimal"/>
+      <w:lvlText w:val="%4."/>
+      <w:lvlJc w:val="left"/>
+      <w:pPr>
+        <w:ind w:left="3960" w:hanging="360"/>
+      </w:pPr>
+    </w:lvl>
+    <w:lvl w:ilvl="4" w:tplc="FFFFFFFF" w:tentative="1">
+      <w:start w:val="1"/>
+      <w:numFmt w:val="lowerLetter"/>
+      <w:lvlText w:val="%5."/>
+      <w:lvlJc w:val="left"/>
+      <w:pPr>
+        <w:ind w:left="4680" w:hanging="360"/>
+      </w:pPr>
+    </w:lvl>
+    <w:lvl w:ilvl="5" w:tplc="FFFFFFFF" w:tentative="1">
+      <w:start w:val="1"/>
+      <w:numFmt w:val="lowerRoman"/>
+      <w:lvlText w:val="%6."/>
+      <w:lvlJc w:val="right"/>
+      <w:pPr>
+        <w:ind w:left="5400" w:hanging="180"/>
+      </w:pPr>
+    </w:lvl>
+    <w:lvl w:ilvl="6" w:tplc="FFFFFFFF" w:tentative="1">
+      <w:start w:val="1"/>
+      <w:numFmt w:val="decimal"/>
+      <w:lvlText w:val="%7."/>
+      <w:lvlJc w:val="left"/>
+      <w:pPr>
+        <w:ind w:left="6120" w:hanging="360"/>
+      </w:pPr>
+    </w:lvl>
+    <w:lvl w:ilvl="7" w:tplc="FFFFFFFF" w:tentative="1">
+      <w:start w:val="1"/>
+      <w:numFmt w:val="lowerLetter"/>
+      <w:lvlText w:val="%8."/>
+      <w:lvlJc w:val="left"/>
+      <w:pPr>
+        <w:ind w:left="6840" w:hanging="360"/>
+      </w:pPr>
+    </w:lvl>
+    <w:lvl w:ilvl="8" w:tplc="FFFFFFFF" w:tentative="1">
+      <w:start w:val="1"/>
+      <w:numFmt w:val="lowerRoman"/>
+      <w:lvlText w:val="%9."/>
+      <w:lvlJc w:val="right"/>
+      <w:pPr>
+        <w:ind w:left="7560" w:hanging="180"/>
+      </w:pPr>
+    </w:lvl>
+  </w:abstractNum>
+  <w:abstractNum w:abstractNumId="4" w15:restartNumberingAfterBreak="0">
     <w:nsid w:val="05245687"/>
     <w:multiLevelType w:val="multilevel"/>
     <w:tmpl w:val="FF109B1C"/>
@@ -8529,7 +9328,183 @@
       </w:rPr>
     </w:lvl>
   </w:abstractNum>
-  <w:abstractNum w:abstractNumId="4" w15:restartNumberingAfterBreak="0">
+  <w:abstractNum w:abstractNumId="5" w15:restartNumberingAfterBreak="0">
+    <w:nsid w:val="05681605"/>
+    <w:multiLevelType w:val="hybridMultilevel"/>
+    <w:tmpl w:val="804207EA"/>
+    <w:lvl w:ilvl="0" w:tplc="13E46D82">
+      <w:start w:val="1"/>
+      <w:numFmt w:val="lowerLetter"/>
+      <w:lvlText w:val="%1)"/>
+      <w:lvlJc w:val="left"/>
+      <w:pPr>
+        <w:ind w:left="360" w:hanging="360"/>
+      </w:pPr>
+      <w:rPr>
+        <w:b/>
+        <w:bCs/>
+      </w:rPr>
+    </w:lvl>
+    <w:lvl w:ilvl="1" w:tplc="FFFFFFFF" w:tentative="1">
+      <w:start w:val="1"/>
+      <w:numFmt w:val="lowerLetter"/>
+      <w:lvlText w:val="%2."/>
+      <w:lvlJc w:val="left"/>
+      <w:pPr>
+        <w:ind w:left="1080" w:hanging="360"/>
+      </w:pPr>
+    </w:lvl>
+    <w:lvl w:ilvl="2" w:tplc="FFFFFFFF" w:tentative="1">
+      <w:start w:val="1"/>
+      <w:numFmt w:val="lowerRoman"/>
+      <w:lvlText w:val="%3."/>
+      <w:lvlJc w:val="right"/>
+      <w:pPr>
+        <w:ind w:left="1800" w:hanging="180"/>
+      </w:pPr>
+    </w:lvl>
+    <w:lvl w:ilvl="3" w:tplc="FFFFFFFF" w:tentative="1">
+      <w:start w:val="1"/>
+      <w:numFmt w:val="decimal"/>
+      <w:lvlText w:val="%4."/>
+      <w:lvlJc w:val="left"/>
+      <w:pPr>
+        <w:ind w:left="2520" w:hanging="360"/>
+      </w:pPr>
+    </w:lvl>
+    <w:lvl w:ilvl="4" w:tplc="FFFFFFFF" w:tentative="1">
+      <w:start w:val="1"/>
+      <w:numFmt w:val="lowerLetter"/>
+      <w:lvlText w:val="%5."/>
+      <w:lvlJc w:val="left"/>
+      <w:pPr>
+        <w:ind w:left="3240" w:hanging="360"/>
+      </w:pPr>
+    </w:lvl>
+    <w:lvl w:ilvl="5" w:tplc="FFFFFFFF" w:tentative="1">
+      <w:start w:val="1"/>
+      <w:numFmt w:val="lowerRoman"/>
+      <w:lvlText w:val="%6."/>
+      <w:lvlJc w:val="right"/>
+      <w:pPr>
+        <w:ind w:left="3960" w:hanging="180"/>
+      </w:pPr>
+    </w:lvl>
+    <w:lvl w:ilvl="6" w:tplc="FFFFFFFF" w:tentative="1">
+      <w:start w:val="1"/>
+      <w:numFmt w:val="decimal"/>
+      <w:lvlText w:val="%7."/>
+      <w:lvlJc w:val="left"/>
+      <w:pPr>
+        <w:ind w:left="4680" w:hanging="360"/>
+      </w:pPr>
+    </w:lvl>
+    <w:lvl w:ilvl="7" w:tplc="FFFFFFFF" w:tentative="1">
+      <w:start w:val="1"/>
+      <w:numFmt w:val="lowerLetter"/>
+      <w:lvlText w:val="%8."/>
+      <w:lvlJc w:val="left"/>
+      <w:pPr>
+        <w:ind w:left="5400" w:hanging="360"/>
+      </w:pPr>
+    </w:lvl>
+    <w:lvl w:ilvl="8" w:tplc="FFFFFFFF" w:tentative="1">
+      <w:start w:val="1"/>
+      <w:numFmt w:val="lowerRoman"/>
+      <w:lvlText w:val="%9."/>
+      <w:lvlJc w:val="right"/>
+      <w:pPr>
+        <w:ind w:left="6120" w:hanging="180"/>
+      </w:pPr>
+    </w:lvl>
+  </w:abstractNum>
+  <w:abstractNum w:abstractNumId="6" w15:restartNumberingAfterBreak="0">
+    <w:nsid w:val="07B901CD"/>
+    <w:multiLevelType w:val="hybridMultilevel"/>
+    <w:tmpl w:val="E9E0B402"/>
+    <w:lvl w:ilvl="0" w:tplc="0409001B">
+      <w:start w:val="1"/>
+      <w:numFmt w:val="lowerRoman"/>
+      <w:lvlText w:val="%1."/>
+      <w:lvlJc w:val="right"/>
+      <w:pPr>
+        <w:ind w:left="1800" w:hanging="360"/>
+      </w:pPr>
+    </w:lvl>
+    <w:lvl w:ilvl="1" w:tplc="FFFFFFFF" w:tentative="1">
+      <w:start w:val="1"/>
+      <w:numFmt w:val="lowerLetter"/>
+      <w:lvlText w:val="%2."/>
+      <w:lvlJc w:val="left"/>
+      <w:pPr>
+        <w:ind w:left="2520" w:hanging="360"/>
+      </w:pPr>
+    </w:lvl>
+    <w:lvl w:ilvl="2" w:tplc="FFFFFFFF" w:tentative="1">
+      <w:start w:val="1"/>
+      <w:numFmt w:val="lowerRoman"/>
+      <w:lvlText w:val="%3."/>
+      <w:lvlJc w:val="right"/>
+      <w:pPr>
+        <w:ind w:left="3240" w:hanging="180"/>
+      </w:pPr>
+    </w:lvl>
+    <w:lvl w:ilvl="3" w:tplc="FFFFFFFF" w:tentative="1">
+      <w:start w:val="1"/>
+      <w:numFmt w:val="decimal"/>
+      <w:lvlText w:val="%4."/>
+      <w:lvlJc w:val="left"/>
+      <w:pPr>
+        <w:ind w:left="3960" w:hanging="360"/>
+      </w:pPr>
+    </w:lvl>
+    <w:lvl w:ilvl="4" w:tplc="FFFFFFFF" w:tentative="1">
+      <w:start w:val="1"/>
+      <w:numFmt w:val="lowerLetter"/>
+      <w:lvlText w:val="%5."/>
+      <w:lvlJc w:val="left"/>
+      <w:pPr>
+        <w:ind w:left="4680" w:hanging="360"/>
+      </w:pPr>
+    </w:lvl>
+    <w:lvl w:ilvl="5" w:tplc="FFFFFFFF" w:tentative="1">
+      <w:start w:val="1"/>
+      <w:numFmt w:val="lowerRoman"/>
+      <w:lvlText w:val="%6."/>
+      <w:lvlJc w:val="right"/>
+      <w:pPr>
+        <w:ind w:left="5400" w:hanging="180"/>
+      </w:pPr>
+    </w:lvl>
+    <w:lvl w:ilvl="6" w:tplc="FFFFFFFF" w:tentative="1">
+      <w:start w:val="1"/>
+      <w:numFmt w:val="decimal"/>
+      <w:lvlText w:val="%7."/>
+      <w:lvlJc w:val="left"/>
+      <w:pPr>
+        <w:ind w:left="6120" w:hanging="360"/>
+      </w:pPr>
+    </w:lvl>
+    <w:lvl w:ilvl="7" w:tplc="FFFFFFFF" w:tentative="1">
+      <w:start w:val="1"/>
+      <w:numFmt w:val="lowerLetter"/>
+      <w:lvlText w:val="%8."/>
+      <w:lvlJc w:val="left"/>
+      <w:pPr>
+        <w:ind w:left="6840" w:hanging="360"/>
+      </w:pPr>
+    </w:lvl>
+    <w:lvl w:ilvl="8" w:tplc="FFFFFFFF" w:tentative="1">
+      <w:start w:val="1"/>
+      <w:numFmt w:val="lowerRoman"/>
+      <w:lvlText w:val="%9."/>
+      <w:lvlJc w:val="right"/>
+      <w:pPr>
+        <w:ind w:left="7560" w:hanging="180"/>
+      </w:pPr>
+    </w:lvl>
+  </w:abstractNum>
+  <w:abstractNum w:abstractNumId="7" w15:restartNumberingAfterBreak="0">
     <w:nsid w:val="08F251D9"/>
     <w:multiLevelType w:val="hybridMultilevel"/>
     <w:tmpl w:val="7D106546"/>
@@ -8615,7 +9590,7 @@
       </w:pPr>
     </w:lvl>
   </w:abstractNum>
-  <w:abstractNum w:abstractNumId="5" w15:restartNumberingAfterBreak="0">
+  <w:abstractNum w:abstractNumId="8" w15:restartNumberingAfterBreak="0">
     <w:nsid w:val="094555C0"/>
     <w:multiLevelType w:val="multilevel"/>
     <w:tmpl w:val="F8E06360"/>
@@ -8728,7 +9703,7 @@
       </w:rPr>
     </w:lvl>
   </w:abstractNum>
-  <w:abstractNum w:abstractNumId="6" w15:restartNumberingAfterBreak="0">
+  <w:abstractNum w:abstractNumId="9" w15:restartNumberingAfterBreak="0">
     <w:nsid w:val="0B991D16"/>
     <w:multiLevelType w:val="hybridMultilevel"/>
     <w:tmpl w:val="99EA490E"/>
@@ -8814,7 +9789,7 @@
       </w:pPr>
     </w:lvl>
   </w:abstractNum>
-  <w:abstractNum w:abstractNumId="7" w15:restartNumberingAfterBreak="0">
+  <w:abstractNum w:abstractNumId="10" w15:restartNumberingAfterBreak="0">
     <w:nsid w:val="0FD64904"/>
     <w:multiLevelType w:val="hybridMultilevel"/>
     <w:tmpl w:val="B07E4EEC"/>
@@ -8900,7 +9875,7 @@
       </w:pPr>
     </w:lvl>
   </w:abstractNum>
-  <w:abstractNum w:abstractNumId="8" w15:restartNumberingAfterBreak="0">
+  <w:abstractNum w:abstractNumId="11" w15:restartNumberingAfterBreak="0">
     <w:nsid w:val="140257FC"/>
     <w:multiLevelType w:val="hybridMultilevel"/>
     <w:tmpl w:val="5AFAA912"/>
@@ -8992,7 +9967,179 @@
       </w:pPr>
     </w:lvl>
   </w:abstractNum>
-  <w:abstractNum w:abstractNumId="9" w15:restartNumberingAfterBreak="0">
+  <w:abstractNum w:abstractNumId="12" w15:restartNumberingAfterBreak="0">
+    <w:nsid w:val="145C5338"/>
+    <w:multiLevelType w:val="hybridMultilevel"/>
+    <w:tmpl w:val="80687DBC"/>
+    <w:lvl w:ilvl="0" w:tplc="0409001B">
+      <w:start w:val="1"/>
+      <w:numFmt w:val="lowerRoman"/>
+      <w:lvlText w:val="%1."/>
+      <w:lvlJc w:val="right"/>
+      <w:pPr>
+        <w:ind w:left="1800" w:hanging="360"/>
+      </w:pPr>
+    </w:lvl>
+    <w:lvl w:ilvl="1" w:tplc="FFFFFFFF" w:tentative="1">
+      <w:start w:val="1"/>
+      <w:numFmt w:val="lowerLetter"/>
+      <w:lvlText w:val="%2."/>
+      <w:lvlJc w:val="left"/>
+      <w:pPr>
+        <w:ind w:left="2520" w:hanging="360"/>
+      </w:pPr>
+    </w:lvl>
+    <w:lvl w:ilvl="2" w:tplc="FFFFFFFF" w:tentative="1">
+      <w:start w:val="1"/>
+      <w:numFmt w:val="lowerRoman"/>
+      <w:lvlText w:val="%3."/>
+      <w:lvlJc w:val="right"/>
+      <w:pPr>
+        <w:ind w:left="3240" w:hanging="180"/>
+      </w:pPr>
+    </w:lvl>
+    <w:lvl w:ilvl="3" w:tplc="FFFFFFFF" w:tentative="1">
+      <w:start w:val="1"/>
+      <w:numFmt w:val="decimal"/>
+      <w:lvlText w:val="%4."/>
+      <w:lvlJc w:val="left"/>
+      <w:pPr>
+        <w:ind w:left="3960" w:hanging="360"/>
+      </w:pPr>
+    </w:lvl>
+    <w:lvl w:ilvl="4" w:tplc="FFFFFFFF" w:tentative="1">
+      <w:start w:val="1"/>
+      <w:numFmt w:val="lowerLetter"/>
+      <w:lvlText w:val="%5."/>
+      <w:lvlJc w:val="left"/>
+      <w:pPr>
+        <w:ind w:left="4680" w:hanging="360"/>
+      </w:pPr>
+    </w:lvl>
+    <w:lvl w:ilvl="5" w:tplc="FFFFFFFF" w:tentative="1">
+      <w:start w:val="1"/>
+      <w:numFmt w:val="lowerRoman"/>
+      <w:lvlText w:val="%6."/>
+      <w:lvlJc w:val="right"/>
+      <w:pPr>
+        <w:ind w:left="5400" w:hanging="180"/>
+      </w:pPr>
+    </w:lvl>
+    <w:lvl w:ilvl="6" w:tplc="FFFFFFFF" w:tentative="1">
+      <w:start w:val="1"/>
+      <w:numFmt w:val="decimal"/>
+      <w:lvlText w:val="%7."/>
+      <w:lvlJc w:val="left"/>
+      <w:pPr>
+        <w:ind w:left="6120" w:hanging="360"/>
+      </w:pPr>
+    </w:lvl>
+    <w:lvl w:ilvl="7" w:tplc="FFFFFFFF" w:tentative="1">
+      <w:start w:val="1"/>
+      <w:numFmt w:val="lowerLetter"/>
+      <w:lvlText w:val="%8."/>
+      <w:lvlJc w:val="left"/>
+      <w:pPr>
+        <w:ind w:left="6840" w:hanging="360"/>
+      </w:pPr>
+    </w:lvl>
+    <w:lvl w:ilvl="8" w:tplc="FFFFFFFF" w:tentative="1">
+      <w:start w:val="1"/>
+      <w:numFmt w:val="lowerRoman"/>
+      <w:lvlText w:val="%9."/>
+      <w:lvlJc w:val="right"/>
+      <w:pPr>
+        <w:ind w:left="7560" w:hanging="180"/>
+      </w:pPr>
+    </w:lvl>
+  </w:abstractNum>
+  <w:abstractNum w:abstractNumId="13" w15:restartNumberingAfterBreak="0">
+    <w:nsid w:val="14FB03FC"/>
+    <w:multiLevelType w:val="hybridMultilevel"/>
+    <w:tmpl w:val="2BAEFE5C"/>
+    <w:lvl w:ilvl="0" w:tplc="04090017">
+      <w:start w:val="1"/>
+      <w:numFmt w:val="lowerLetter"/>
+      <w:lvlText w:val="%1)"/>
+      <w:lvlJc w:val="left"/>
+      <w:pPr>
+        <w:ind w:left="360" w:hanging="360"/>
+      </w:pPr>
+    </w:lvl>
+    <w:lvl w:ilvl="1" w:tplc="04090019" w:tentative="1">
+      <w:start w:val="1"/>
+      <w:numFmt w:val="lowerLetter"/>
+      <w:lvlText w:val="%2."/>
+      <w:lvlJc w:val="left"/>
+      <w:pPr>
+        <w:ind w:left="1080" w:hanging="360"/>
+      </w:pPr>
+    </w:lvl>
+    <w:lvl w:ilvl="2" w:tplc="0409001B" w:tentative="1">
+      <w:start w:val="1"/>
+      <w:numFmt w:val="lowerRoman"/>
+      <w:lvlText w:val="%3."/>
+      <w:lvlJc w:val="right"/>
+      <w:pPr>
+        <w:ind w:left="1800" w:hanging="180"/>
+      </w:pPr>
+    </w:lvl>
+    <w:lvl w:ilvl="3" w:tplc="0409000F" w:tentative="1">
+      <w:start w:val="1"/>
+      <w:numFmt w:val="decimal"/>
+      <w:lvlText w:val="%4."/>
+      <w:lvlJc w:val="left"/>
+      <w:pPr>
+        <w:ind w:left="2520" w:hanging="360"/>
+      </w:pPr>
+    </w:lvl>
+    <w:lvl w:ilvl="4" w:tplc="04090019" w:tentative="1">
+      <w:start w:val="1"/>
+      <w:numFmt w:val="lowerLetter"/>
+      <w:lvlText w:val="%5."/>
+      <w:lvlJc w:val="left"/>
+      <w:pPr>
+        <w:ind w:left="3240" w:hanging="360"/>
+      </w:pPr>
+    </w:lvl>
+    <w:lvl w:ilvl="5" w:tplc="0409001B" w:tentative="1">
+      <w:start w:val="1"/>
+      <w:numFmt w:val="lowerRoman"/>
+      <w:lvlText w:val="%6."/>
+      <w:lvlJc w:val="right"/>
+      <w:pPr>
+        <w:ind w:left="3960" w:hanging="180"/>
+      </w:pPr>
+    </w:lvl>
+    <w:lvl w:ilvl="6" w:tplc="0409000F" w:tentative="1">
+      <w:start w:val="1"/>
+      <w:numFmt w:val="decimal"/>
+      <w:lvlText w:val="%7."/>
+      <w:lvlJc w:val="left"/>
+      <w:pPr>
+        <w:ind w:left="4680" w:hanging="360"/>
+      </w:pPr>
+    </w:lvl>
+    <w:lvl w:ilvl="7" w:tplc="04090019" w:tentative="1">
+      <w:start w:val="1"/>
+      <w:numFmt w:val="lowerLetter"/>
+      <w:lvlText w:val="%8."/>
+      <w:lvlJc w:val="left"/>
+      <w:pPr>
+        <w:ind w:left="5400" w:hanging="360"/>
+      </w:pPr>
+    </w:lvl>
+    <w:lvl w:ilvl="8" w:tplc="0409001B" w:tentative="1">
+      <w:start w:val="1"/>
+      <w:numFmt w:val="lowerRoman"/>
+      <w:lvlText w:val="%9."/>
+      <w:lvlJc w:val="right"/>
+      <w:pPr>
+        <w:ind w:left="6120" w:hanging="180"/>
+      </w:pPr>
+    </w:lvl>
+  </w:abstractNum>
+  <w:abstractNum w:abstractNumId="14" w15:restartNumberingAfterBreak="0">
     <w:nsid w:val="15603B80"/>
     <w:multiLevelType w:val="hybridMultilevel"/>
     <w:tmpl w:val="978C83AC"/>
@@ -9078,7 +10225,7 @@
       </w:pPr>
     </w:lvl>
   </w:abstractNum>
-  <w:abstractNum w:abstractNumId="10" w15:restartNumberingAfterBreak="0">
+  <w:abstractNum w:abstractNumId="15" w15:restartNumberingAfterBreak="0">
     <w:nsid w:val="18A702C2"/>
     <w:multiLevelType w:val="multilevel"/>
     <w:tmpl w:val="F16C7F0C"/>
@@ -9228,7 +10375,7 @@
       </w:rPr>
     </w:lvl>
   </w:abstractNum>
-  <w:abstractNum w:abstractNumId="11" w15:restartNumberingAfterBreak="0">
+  <w:abstractNum w:abstractNumId="16" w15:restartNumberingAfterBreak="0">
     <w:nsid w:val="19C96B6C"/>
     <w:multiLevelType w:val="multilevel"/>
     <w:tmpl w:val="FD7E77DC"/>
@@ -9370,7 +10517,7 @@
       </w:rPr>
     </w:lvl>
   </w:abstractNum>
-  <w:abstractNum w:abstractNumId="12" w15:restartNumberingAfterBreak="0">
+  <w:abstractNum w:abstractNumId="17" w15:restartNumberingAfterBreak="0">
     <w:nsid w:val="1A137D3D"/>
     <w:multiLevelType w:val="hybridMultilevel"/>
     <w:tmpl w:val="CDF83982"/>
@@ -9456,7 +10603,97 @@
       </w:pPr>
     </w:lvl>
   </w:abstractNum>
-  <w:abstractNum w:abstractNumId="13" w15:restartNumberingAfterBreak="0">
+  <w:abstractNum w:abstractNumId="18" w15:restartNumberingAfterBreak="0">
+    <w:nsid w:val="1F535C6F"/>
+    <w:multiLevelType w:val="hybridMultilevel"/>
+    <w:tmpl w:val="3EB407D8"/>
+    <w:lvl w:ilvl="0" w:tplc="223A61E0">
+      <w:start w:val="1"/>
+      <w:numFmt w:val="lowerLetter"/>
+      <w:lvlText w:val="%1)"/>
+      <w:lvlJc w:val="left"/>
+      <w:pPr>
+        <w:ind w:left="1260" w:hanging="360"/>
+      </w:pPr>
+      <w:rPr>
+        <w:b/>
+        <w:bCs/>
+      </w:rPr>
+    </w:lvl>
+    <w:lvl w:ilvl="1" w:tplc="04090019" w:tentative="1">
+      <w:start w:val="1"/>
+      <w:numFmt w:val="lowerLetter"/>
+      <w:lvlText w:val="%2."/>
+      <w:lvlJc w:val="left"/>
+      <w:pPr>
+        <w:ind w:left="1980" w:hanging="360"/>
+      </w:pPr>
+    </w:lvl>
+    <w:lvl w:ilvl="2" w:tplc="0409001B" w:tentative="1">
+      <w:start w:val="1"/>
+      <w:numFmt w:val="lowerRoman"/>
+      <w:lvlText w:val="%3."/>
+      <w:lvlJc w:val="right"/>
+      <w:pPr>
+        <w:ind w:left="2700" w:hanging="180"/>
+      </w:pPr>
+    </w:lvl>
+    <w:lvl w:ilvl="3" w:tplc="0409000F" w:tentative="1">
+      <w:start w:val="1"/>
+      <w:numFmt w:val="decimal"/>
+      <w:lvlText w:val="%4."/>
+      <w:lvlJc w:val="left"/>
+      <w:pPr>
+        <w:ind w:left="3420" w:hanging="360"/>
+      </w:pPr>
+    </w:lvl>
+    <w:lvl w:ilvl="4" w:tplc="04090019" w:tentative="1">
+      <w:start w:val="1"/>
+      <w:numFmt w:val="lowerLetter"/>
+      <w:lvlText w:val="%5."/>
+      <w:lvlJc w:val="left"/>
+      <w:pPr>
+        <w:ind w:left="4140" w:hanging="360"/>
+      </w:pPr>
+    </w:lvl>
+    <w:lvl w:ilvl="5" w:tplc="0409001B" w:tentative="1">
+      <w:start w:val="1"/>
+      <w:numFmt w:val="lowerRoman"/>
+      <w:lvlText w:val="%6."/>
+      <w:lvlJc w:val="right"/>
+      <w:pPr>
+        <w:ind w:left="4860" w:hanging="180"/>
+      </w:pPr>
+    </w:lvl>
+    <w:lvl w:ilvl="6" w:tplc="0409000F" w:tentative="1">
+      <w:start w:val="1"/>
+      <w:numFmt w:val="decimal"/>
+      <w:lvlText w:val="%7."/>
+      <w:lvlJc w:val="left"/>
+      <w:pPr>
+        <w:ind w:left="5580" w:hanging="360"/>
+      </w:pPr>
+    </w:lvl>
+    <w:lvl w:ilvl="7" w:tplc="04090019" w:tentative="1">
+      <w:start w:val="1"/>
+      <w:numFmt w:val="lowerLetter"/>
+      <w:lvlText w:val="%8."/>
+      <w:lvlJc w:val="left"/>
+      <w:pPr>
+        <w:ind w:left="6300" w:hanging="360"/>
+      </w:pPr>
+    </w:lvl>
+    <w:lvl w:ilvl="8" w:tplc="0409001B" w:tentative="1">
+      <w:start w:val="1"/>
+      <w:numFmt w:val="lowerRoman"/>
+      <w:lvlText w:val="%9."/>
+      <w:lvlJc w:val="right"/>
+      <w:pPr>
+        <w:ind w:left="7020" w:hanging="180"/>
+      </w:pPr>
+    </w:lvl>
+  </w:abstractNum>
+  <w:abstractNum w:abstractNumId="19" w15:restartNumberingAfterBreak="0">
     <w:nsid w:val="26303F10"/>
     <w:multiLevelType w:val="multilevel"/>
     <w:tmpl w:val="A9D4C56C"/>
@@ -9598,7 +10835,7 @@
       </w:rPr>
     </w:lvl>
   </w:abstractNum>
-  <w:abstractNum w:abstractNumId="14" w15:restartNumberingAfterBreak="0">
+  <w:abstractNum w:abstractNumId="20" w15:restartNumberingAfterBreak="0">
     <w:nsid w:val="26A0136B"/>
     <w:multiLevelType w:val="hybridMultilevel"/>
     <w:tmpl w:val="6512FC7A"/>
@@ -9684,7 +10921,93 @@
       </w:pPr>
     </w:lvl>
   </w:abstractNum>
-  <w:abstractNum w:abstractNumId="15" w15:restartNumberingAfterBreak="0">
+  <w:abstractNum w:abstractNumId="21" w15:restartNumberingAfterBreak="0">
+    <w:nsid w:val="28D945F7"/>
+    <w:multiLevelType w:val="hybridMultilevel"/>
+    <w:tmpl w:val="C50620CA"/>
+    <w:lvl w:ilvl="0" w:tplc="FFFFFFFF">
+      <w:start w:val="1"/>
+      <w:numFmt w:val="lowerLetter"/>
+      <w:lvlText w:val="%1)"/>
+      <w:lvlJc w:val="left"/>
+      <w:pPr>
+        <w:ind w:left="1260" w:hanging="360"/>
+      </w:pPr>
+    </w:lvl>
+    <w:lvl w:ilvl="1" w:tplc="FFFFFFFF">
+      <w:start w:val="1"/>
+      <w:numFmt w:val="lowerRoman"/>
+      <w:lvlText w:val="%2."/>
+      <w:lvlJc w:val="right"/>
+      <w:pPr>
+        <w:ind w:left="1620" w:hanging="360"/>
+      </w:pPr>
+    </w:lvl>
+    <w:lvl w:ilvl="2" w:tplc="FFFFFFFF" w:tentative="1">
+      <w:start w:val="1"/>
+      <w:numFmt w:val="lowerRoman"/>
+      <w:lvlText w:val="%3."/>
+      <w:lvlJc w:val="right"/>
+      <w:pPr>
+        <w:ind w:left="2700" w:hanging="180"/>
+      </w:pPr>
+    </w:lvl>
+    <w:lvl w:ilvl="3" w:tplc="FFFFFFFF" w:tentative="1">
+      <w:start w:val="1"/>
+      <w:numFmt w:val="decimal"/>
+      <w:lvlText w:val="%4."/>
+      <w:lvlJc w:val="left"/>
+      <w:pPr>
+        <w:ind w:left="3420" w:hanging="360"/>
+      </w:pPr>
+    </w:lvl>
+    <w:lvl w:ilvl="4" w:tplc="FFFFFFFF" w:tentative="1">
+      <w:start w:val="1"/>
+      <w:numFmt w:val="lowerLetter"/>
+      <w:lvlText w:val="%5."/>
+      <w:lvlJc w:val="left"/>
+      <w:pPr>
+        <w:ind w:left="4140" w:hanging="360"/>
+      </w:pPr>
+    </w:lvl>
+    <w:lvl w:ilvl="5" w:tplc="FFFFFFFF" w:tentative="1">
+      <w:start w:val="1"/>
+      <w:numFmt w:val="lowerRoman"/>
+      <w:lvlText w:val="%6."/>
+      <w:lvlJc w:val="right"/>
+      <w:pPr>
+        <w:ind w:left="4860" w:hanging="180"/>
+      </w:pPr>
+    </w:lvl>
+    <w:lvl w:ilvl="6" w:tplc="FFFFFFFF" w:tentative="1">
+      <w:start w:val="1"/>
+      <w:numFmt w:val="decimal"/>
+      <w:lvlText w:val="%7."/>
+      <w:lvlJc w:val="left"/>
+      <w:pPr>
+        <w:ind w:left="5580" w:hanging="360"/>
+      </w:pPr>
+    </w:lvl>
+    <w:lvl w:ilvl="7" w:tplc="FFFFFFFF" w:tentative="1">
+      <w:start w:val="1"/>
+      <w:numFmt w:val="lowerLetter"/>
+      <w:lvlText w:val="%8."/>
+      <w:lvlJc w:val="left"/>
+      <w:pPr>
+        <w:ind w:left="6300" w:hanging="360"/>
+      </w:pPr>
+    </w:lvl>
+    <w:lvl w:ilvl="8" w:tplc="FFFFFFFF" w:tentative="1">
+      <w:start w:val="1"/>
+      <w:numFmt w:val="lowerRoman"/>
+      <w:lvlText w:val="%9."/>
+      <w:lvlJc w:val="right"/>
+      <w:pPr>
+        <w:ind w:left="7020" w:hanging="180"/>
+      </w:pPr>
+    </w:lvl>
+  </w:abstractNum>
+  <w:abstractNum w:abstractNumId="22" w15:restartNumberingAfterBreak="0">
     <w:nsid w:val="29A42D58"/>
     <w:multiLevelType w:val="hybridMultilevel"/>
     <w:tmpl w:val="6E228030"/>
@@ -9770,7 +11093,7 @@
       </w:pPr>
     </w:lvl>
   </w:abstractNum>
-  <w:abstractNum w:abstractNumId="16" w15:restartNumberingAfterBreak="0">
+  <w:abstractNum w:abstractNumId="23" w15:restartNumberingAfterBreak="0">
     <w:nsid w:val="2BC973E5"/>
     <w:multiLevelType w:val="hybridMultilevel"/>
     <w:tmpl w:val="AC90B99A"/>
@@ -9856,7 +11179,7 @@
       </w:pPr>
     </w:lvl>
   </w:abstractNum>
-  <w:abstractNum w:abstractNumId="17" w15:restartNumberingAfterBreak="0">
+  <w:abstractNum w:abstractNumId="24" w15:restartNumberingAfterBreak="0">
     <w:nsid w:val="2E275953"/>
     <w:multiLevelType w:val="hybridMultilevel"/>
     <w:tmpl w:val="033EC5CE"/>
@@ -9942,7 +11265,7 @@
       </w:pPr>
     </w:lvl>
   </w:abstractNum>
-  <w:abstractNum w:abstractNumId="18" w15:restartNumberingAfterBreak="0">
+  <w:abstractNum w:abstractNumId="25" w15:restartNumberingAfterBreak="0">
     <w:nsid w:val="302F38FE"/>
     <w:multiLevelType w:val="hybridMultilevel"/>
     <w:tmpl w:val="4A367CA8"/>
@@ -10032,7 +11355,7 @@
       </w:pPr>
     </w:lvl>
   </w:abstractNum>
-  <w:abstractNum w:abstractNumId="19" w15:restartNumberingAfterBreak="0">
+  <w:abstractNum w:abstractNumId="26" w15:restartNumberingAfterBreak="0">
     <w:nsid w:val="33980448"/>
     <w:multiLevelType w:val="hybridMultilevel"/>
     <w:tmpl w:val="C49661F0"/>
@@ -10118,7 +11441,7 @@
       </w:pPr>
     </w:lvl>
   </w:abstractNum>
-  <w:abstractNum w:abstractNumId="20" w15:restartNumberingAfterBreak="0">
+  <w:abstractNum w:abstractNumId="27" w15:restartNumberingAfterBreak="0">
     <w:nsid w:val="342E0560"/>
     <w:multiLevelType w:val="hybridMultilevel"/>
     <w:tmpl w:val="AB5A4470"/>
@@ -10204,7 +11527,93 @@
       </w:pPr>
     </w:lvl>
   </w:abstractNum>
-  <w:abstractNum w:abstractNumId="21" w15:restartNumberingAfterBreak="0">
+  <w:abstractNum w:abstractNumId="28" w15:restartNumberingAfterBreak="0">
+    <w:nsid w:val="34F02548"/>
+    <w:multiLevelType w:val="hybridMultilevel"/>
+    <w:tmpl w:val="04C089DC"/>
+    <w:lvl w:ilvl="0" w:tplc="04090017">
+      <w:start w:val="1"/>
+      <w:numFmt w:val="lowerLetter"/>
+      <w:lvlText w:val="%1)"/>
+      <w:lvlJc w:val="left"/>
+      <w:pPr>
+        <w:ind w:left="1080" w:hanging="360"/>
+      </w:pPr>
+    </w:lvl>
+    <w:lvl w:ilvl="1" w:tplc="04090019" w:tentative="1">
+      <w:start w:val="1"/>
+      <w:numFmt w:val="lowerLetter"/>
+      <w:lvlText w:val="%2."/>
+      <w:lvlJc w:val="left"/>
+      <w:pPr>
+        <w:ind w:left="1800" w:hanging="360"/>
+      </w:pPr>
+    </w:lvl>
+    <w:lvl w:ilvl="2" w:tplc="0409001B" w:tentative="1">
+      <w:start w:val="1"/>
+      <w:numFmt w:val="lowerRoman"/>
+      <w:lvlText w:val="%3."/>
+      <w:lvlJc w:val="right"/>
+      <w:pPr>
+        <w:ind w:left="2520" w:hanging="180"/>
+      </w:pPr>
+    </w:lvl>
+    <w:lvl w:ilvl="3" w:tplc="0409000F" w:tentative="1">
+      <w:start w:val="1"/>
+      <w:numFmt w:val="decimal"/>
+      <w:lvlText w:val="%4."/>
+      <w:lvlJc w:val="left"/>
+      <w:pPr>
+        <w:ind w:left="3240" w:hanging="360"/>
+      </w:pPr>
+    </w:lvl>
+    <w:lvl w:ilvl="4" w:tplc="04090019" w:tentative="1">
+      <w:start w:val="1"/>
+      <w:numFmt w:val="lowerLetter"/>
+      <w:lvlText w:val="%5."/>
+      <w:lvlJc w:val="left"/>
+      <w:pPr>
+        <w:ind w:left="3960" w:hanging="360"/>
+      </w:pPr>
+    </w:lvl>
+    <w:lvl w:ilvl="5" w:tplc="0409001B" w:tentative="1">
+      <w:start w:val="1"/>
+      <w:numFmt w:val="lowerRoman"/>
+      <w:lvlText w:val="%6."/>
+      <w:lvlJc w:val="right"/>
+      <w:pPr>
+        <w:ind w:left="4680" w:hanging="180"/>
+      </w:pPr>
+    </w:lvl>
+    <w:lvl w:ilvl="6" w:tplc="0409000F" w:tentative="1">
+      <w:start w:val="1"/>
+      <w:numFmt w:val="decimal"/>
+      <w:lvlText w:val="%7."/>
+      <w:lvlJc w:val="left"/>
+      <w:pPr>
+        <w:ind w:left="5400" w:hanging="360"/>
+      </w:pPr>
+    </w:lvl>
+    <w:lvl w:ilvl="7" w:tplc="04090019" w:tentative="1">
+      <w:start w:val="1"/>
+      <w:numFmt w:val="lowerLetter"/>
+      <w:lvlText w:val="%8."/>
+      <w:lvlJc w:val="left"/>
+      <w:pPr>
+        <w:ind w:left="6120" w:hanging="360"/>
+      </w:pPr>
+    </w:lvl>
+    <w:lvl w:ilvl="8" w:tplc="0409001B" w:tentative="1">
+      <w:start w:val="1"/>
+      <w:numFmt w:val="lowerRoman"/>
+      <w:lvlText w:val="%9."/>
+      <w:lvlJc w:val="right"/>
+      <w:pPr>
+        <w:ind w:left="6840" w:hanging="180"/>
+      </w:pPr>
+    </w:lvl>
+  </w:abstractNum>
+  <w:abstractNum w:abstractNumId="29" w15:restartNumberingAfterBreak="0">
     <w:nsid w:val="34F843C6"/>
     <w:multiLevelType w:val="multilevel"/>
     <w:tmpl w:val="81F4F488"/>
@@ -10353,7 +11762,7 @@
       </w:rPr>
     </w:lvl>
   </w:abstractNum>
-  <w:abstractNum w:abstractNumId="22" w15:restartNumberingAfterBreak="0">
+  <w:abstractNum w:abstractNumId="30" w15:restartNumberingAfterBreak="0">
     <w:nsid w:val="36936560"/>
     <w:multiLevelType w:val="hybridMultilevel"/>
     <w:tmpl w:val="E0CCB6D2"/>
@@ -10439,10 +11848,10 @@
       </w:pPr>
     </w:lvl>
   </w:abstractNum>
-  <w:abstractNum w:abstractNumId="23" w15:restartNumberingAfterBreak="0">
+  <w:abstractNum w:abstractNumId="31" w15:restartNumberingAfterBreak="0">
     <w:nsid w:val="36AD3AFB"/>
     <w:multiLevelType w:val="hybridMultilevel"/>
-    <w:tmpl w:val="61B6F496"/>
+    <w:tmpl w:val="22E86F4C"/>
     <w:lvl w:ilvl="0" w:tplc="04090017">
       <w:start w:val="1"/>
       <w:numFmt w:val="lowerLetter"/>
@@ -10525,7 +11934,7 @@
       </w:pPr>
     </w:lvl>
   </w:abstractNum>
-  <w:abstractNum w:abstractNumId="24" w15:restartNumberingAfterBreak="0">
+  <w:abstractNum w:abstractNumId="32" w15:restartNumberingAfterBreak="0">
     <w:nsid w:val="38E15CA9"/>
     <w:multiLevelType w:val="hybridMultilevel"/>
     <w:tmpl w:val="234A5208"/>
@@ -10615,7 +12024,7 @@
       </w:pPr>
     </w:lvl>
   </w:abstractNum>
-  <w:abstractNum w:abstractNumId="25" w15:restartNumberingAfterBreak="0">
+  <w:abstractNum w:abstractNumId="33" w15:restartNumberingAfterBreak="0">
     <w:nsid w:val="3D937740"/>
     <w:multiLevelType w:val="hybridMultilevel"/>
     <w:tmpl w:val="35940172"/>
@@ -10701,7 +12110,93 @@
       </w:pPr>
     </w:lvl>
   </w:abstractNum>
-  <w:abstractNum w:abstractNumId="26" w15:restartNumberingAfterBreak="0">
+  <w:abstractNum w:abstractNumId="34" w15:restartNumberingAfterBreak="0">
+    <w:nsid w:val="3DDB3393"/>
+    <w:multiLevelType w:val="hybridMultilevel"/>
+    <w:tmpl w:val="916E9664"/>
+    <w:lvl w:ilvl="0" w:tplc="04090017">
+      <w:start w:val="1"/>
+      <w:numFmt w:val="lowerLetter"/>
+      <w:lvlText w:val="%1)"/>
+      <w:lvlJc w:val="left"/>
+      <w:pPr>
+        <w:ind w:left="360" w:hanging="360"/>
+      </w:pPr>
+    </w:lvl>
+    <w:lvl w:ilvl="1" w:tplc="04090019" w:tentative="1">
+      <w:start w:val="1"/>
+      <w:numFmt w:val="lowerLetter"/>
+      <w:lvlText w:val="%2."/>
+      <w:lvlJc w:val="left"/>
+      <w:pPr>
+        <w:ind w:left="1080" w:hanging="360"/>
+      </w:pPr>
+    </w:lvl>
+    <w:lvl w:ilvl="2" w:tplc="0409001B" w:tentative="1">
+      <w:start w:val="1"/>
+      <w:numFmt w:val="lowerRoman"/>
+      <w:lvlText w:val="%3."/>
+      <w:lvlJc w:val="right"/>
+      <w:pPr>
+        <w:ind w:left="1800" w:hanging="180"/>
+      </w:pPr>
+    </w:lvl>
+    <w:lvl w:ilvl="3" w:tplc="0409000F" w:tentative="1">
+      <w:start w:val="1"/>
+      <w:numFmt w:val="decimal"/>
+      <w:lvlText w:val="%4."/>
+      <w:lvlJc w:val="left"/>
+      <w:pPr>
+        <w:ind w:left="2520" w:hanging="360"/>
+      </w:pPr>
+    </w:lvl>
+    <w:lvl w:ilvl="4" w:tplc="04090019" w:tentative="1">
+      <w:start w:val="1"/>
+      <w:numFmt w:val="lowerLetter"/>
+      <w:lvlText w:val="%5."/>
+      <w:lvlJc w:val="left"/>
+      <w:pPr>
+        <w:ind w:left="3240" w:hanging="360"/>
+      </w:pPr>
+    </w:lvl>
+    <w:lvl w:ilvl="5" w:tplc="0409001B" w:tentative="1">
+      <w:start w:val="1"/>
+      <w:numFmt w:val="lowerRoman"/>
+      <w:lvlText w:val="%6."/>
+      <w:lvlJc w:val="right"/>
+      <w:pPr>
+        <w:ind w:left="3960" w:hanging="180"/>
+      </w:pPr>
+    </w:lvl>
+    <w:lvl w:ilvl="6" w:tplc="0409000F" w:tentative="1">
+      <w:start w:val="1"/>
+      <w:numFmt w:val="decimal"/>
+      <w:lvlText w:val="%7."/>
+      <w:lvlJc w:val="left"/>
+      <w:pPr>
+        <w:ind w:left="4680" w:hanging="360"/>
+      </w:pPr>
+    </w:lvl>
+    <w:lvl w:ilvl="7" w:tplc="04090019" w:tentative="1">
+      <w:start w:val="1"/>
+      <w:numFmt w:val="lowerLetter"/>
+      <w:lvlText w:val="%8."/>
+      <w:lvlJc w:val="left"/>
+      <w:pPr>
+        <w:ind w:left="5400" w:hanging="360"/>
+      </w:pPr>
+    </w:lvl>
+    <w:lvl w:ilvl="8" w:tplc="0409001B" w:tentative="1">
+      <w:start w:val="1"/>
+      <w:numFmt w:val="lowerRoman"/>
+      <w:lvlText w:val="%9."/>
+      <w:lvlJc w:val="right"/>
+      <w:pPr>
+        <w:ind w:left="6120" w:hanging="180"/>
+      </w:pPr>
+    </w:lvl>
+  </w:abstractNum>
+  <w:abstractNum w:abstractNumId="35" w15:restartNumberingAfterBreak="0">
     <w:nsid w:val="3F1A00C3"/>
     <w:multiLevelType w:val="hybridMultilevel"/>
     <w:tmpl w:val="CC94C33A"/>
@@ -10787,7 +12282,93 @@
       </w:pPr>
     </w:lvl>
   </w:abstractNum>
-  <w:abstractNum w:abstractNumId="27" w15:restartNumberingAfterBreak="0">
+  <w:abstractNum w:abstractNumId="36" w15:restartNumberingAfterBreak="0">
+    <w:nsid w:val="3FDA4387"/>
+    <w:multiLevelType w:val="hybridMultilevel"/>
+    <w:tmpl w:val="3C086A62"/>
+    <w:lvl w:ilvl="0" w:tplc="04090013">
+      <w:start w:val="1"/>
+      <w:numFmt w:val="upperRoman"/>
+      <w:lvlText w:val="%1."/>
+      <w:lvlJc w:val="right"/>
+      <w:pPr>
+        <w:ind w:left="360" w:hanging="360"/>
+      </w:pPr>
+    </w:lvl>
+    <w:lvl w:ilvl="1" w:tplc="FFFFFFFF" w:tentative="1">
+      <w:start w:val="1"/>
+      <w:numFmt w:val="lowerLetter"/>
+      <w:lvlText w:val="%2."/>
+      <w:lvlJc w:val="left"/>
+      <w:pPr>
+        <w:ind w:left="1080" w:hanging="360"/>
+      </w:pPr>
+    </w:lvl>
+    <w:lvl w:ilvl="2" w:tplc="FFFFFFFF" w:tentative="1">
+      <w:start w:val="1"/>
+      <w:numFmt w:val="lowerRoman"/>
+      <w:lvlText w:val="%3."/>
+      <w:lvlJc w:val="right"/>
+      <w:pPr>
+        <w:ind w:left="1800" w:hanging="180"/>
+      </w:pPr>
+    </w:lvl>
+    <w:lvl w:ilvl="3" w:tplc="FFFFFFFF" w:tentative="1">
+      <w:start w:val="1"/>
+      <w:numFmt w:val="decimal"/>
+      <w:lvlText w:val="%4."/>
+      <w:lvlJc w:val="left"/>
+      <w:pPr>
+        <w:ind w:left="2520" w:hanging="360"/>
+      </w:pPr>
+    </w:lvl>
+    <w:lvl w:ilvl="4" w:tplc="FFFFFFFF" w:tentative="1">
+      <w:start w:val="1"/>
+      <w:numFmt w:val="lowerLetter"/>
+      <w:lvlText w:val="%5."/>
+      <w:lvlJc w:val="left"/>
+      <w:pPr>
+        <w:ind w:left="3240" w:hanging="360"/>
+      </w:pPr>
+    </w:lvl>
+    <w:lvl w:ilvl="5" w:tplc="FFFFFFFF" w:tentative="1">
+      <w:start w:val="1"/>
+      <w:numFmt w:val="lowerRoman"/>
+      <w:lvlText w:val="%6."/>
+      <w:lvlJc w:val="right"/>
+      <w:pPr>
+        <w:ind w:left="3960" w:hanging="180"/>
+      </w:pPr>
+    </w:lvl>
+    <w:lvl w:ilvl="6" w:tplc="FFFFFFFF" w:tentative="1">
+      <w:start w:val="1"/>
+      <w:numFmt w:val="decimal"/>
+      <w:lvlText w:val="%7."/>
+      <w:lvlJc w:val="left"/>
+      <w:pPr>
+        <w:ind w:left="4680" w:hanging="360"/>
+      </w:pPr>
+    </w:lvl>
+    <w:lvl w:ilvl="7" w:tplc="FFFFFFFF" w:tentative="1">
+      <w:start w:val="1"/>
+      <w:numFmt w:val="lowerLetter"/>
+      <w:lvlText w:val="%8."/>
+      <w:lvlJc w:val="left"/>
+      <w:pPr>
+        <w:ind w:left="5400" w:hanging="360"/>
+      </w:pPr>
+    </w:lvl>
+    <w:lvl w:ilvl="8" w:tplc="FFFFFFFF" w:tentative="1">
+      <w:start w:val="1"/>
+      <w:numFmt w:val="lowerRoman"/>
+      <w:lvlText w:val="%9."/>
+      <w:lvlJc w:val="right"/>
+      <w:pPr>
+        <w:ind w:left="6120" w:hanging="180"/>
+      </w:pPr>
+    </w:lvl>
+  </w:abstractNum>
+  <w:abstractNum w:abstractNumId="37" w15:restartNumberingAfterBreak="0">
     <w:nsid w:val="48FF2D21"/>
     <w:multiLevelType w:val="hybridMultilevel"/>
     <w:tmpl w:val="11FAF93A"/>
@@ -10873,7 +12454,7 @@
       </w:pPr>
     </w:lvl>
   </w:abstractNum>
-  <w:abstractNum w:abstractNumId="28" w15:restartNumberingAfterBreak="0">
+  <w:abstractNum w:abstractNumId="38" w15:restartNumberingAfterBreak="0">
     <w:nsid w:val="49CD05D2"/>
     <w:multiLevelType w:val="multilevel"/>
     <w:tmpl w:val="578E52C0"/>
@@ -11023,7 +12604,7 @@
       </w:rPr>
     </w:lvl>
   </w:abstractNum>
-  <w:abstractNum w:abstractNumId="29" w15:restartNumberingAfterBreak="0">
+  <w:abstractNum w:abstractNumId="39" w15:restartNumberingAfterBreak="0">
     <w:nsid w:val="4C6215C6"/>
     <w:multiLevelType w:val="hybridMultilevel"/>
     <w:tmpl w:val="FE8E3E6A"/>
@@ -11112,7 +12693,7 @@
       </w:pPr>
     </w:lvl>
   </w:abstractNum>
-  <w:abstractNum w:abstractNumId="30" w15:restartNumberingAfterBreak="0">
+  <w:abstractNum w:abstractNumId="40" w15:restartNumberingAfterBreak="0">
     <w:nsid w:val="4FD85B42"/>
     <w:multiLevelType w:val="hybridMultilevel"/>
     <w:tmpl w:val="0812F8E0"/>
@@ -11225,7 +12806,121 @@
       </w:rPr>
     </w:lvl>
   </w:abstractNum>
-  <w:abstractNum w:abstractNumId="31" w15:restartNumberingAfterBreak="0">
+  <w:abstractNum w:abstractNumId="41" w15:restartNumberingAfterBreak="0">
+    <w:nsid w:val="51340CBB"/>
+    <w:multiLevelType w:val="multilevel"/>
+    <w:tmpl w:val="B3FE92AE"/>
+    <w:lvl w:ilvl="0">
+      <w:start w:val="1"/>
+      <w:numFmt w:val="decimal"/>
+      <w:lvlText w:val="%1."/>
+      <w:lvlJc w:val="left"/>
+      <w:pPr>
+        <w:ind w:left="420" w:hanging="420"/>
+      </w:pPr>
+      <w:rPr>
+        <w:rFonts w:hint="default"/>
+      </w:rPr>
+    </w:lvl>
+    <w:lvl w:ilvl="1">
+      <w:start w:val="1"/>
+      <w:numFmt w:val="decimal"/>
+      <w:lvlText w:val="%1.%2."/>
+      <w:lvlJc w:val="left"/>
+      <w:pPr>
+        <w:ind w:left="420" w:hanging="420"/>
+      </w:pPr>
+      <w:rPr>
+        <w:rFonts w:hint="default"/>
+      </w:rPr>
+    </w:lvl>
+    <w:lvl w:ilvl="2">
+      <w:start w:val="1"/>
+      <w:numFmt w:val="decimal"/>
+      <w:lvlText w:val="%1.%2.%3."/>
+      <w:lvlJc w:val="left"/>
+      <w:pPr>
+        <w:ind w:left="720" w:hanging="720"/>
+      </w:pPr>
+      <w:rPr>
+        <w:rFonts w:hint="default"/>
+        <w:b/>
+      </w:rPr>
+    </w:lvl>
+    <w:lvl w:ilvl="3">
+      <w:start w:val="1"/>
+      <w:numFmt w:val="decimal"/>
+      <w:lvlText w:val="%1.%2.%3.%4."/>
+      <w:lvlJc w:val="left"/>
+      <w:pPr>
+        <w:ind w:left="720" w:hanging="720"/>
+      </w:pPr>
+      <w:rPr>
+        <w:rFonts w:hint="default"/>
+      </w:rPr>
+    </w:lvl>
+    <w:lvl w:ilvl="4">
+      <w:start w:val="1"/>
+      <w:numFmt w:val="decimal"/>
+      <w:lvlText w:val="%1.%2.%3.%4.%5."/>
+      <w:lvlJc w:val="left"/>
+      <w:pPr>
+        <w:ind w:left="1080" w:hanging="1080"/>
+      </w:pPr>
+      <w:rPr>
+        <w:rFonts w:hint="default"/>
+      </w:rPr>
+    </w:lvl>
+    <w:lvl w:ilvl="5">
+      <w:start w:val="1"/>
+      <w:numFmt w:val="decimal"/>
+      <w:lvlText w:val="%1.%2.%3.%4.%5.%6."/>
+      <w:lvlJc w:val="left"/>
+      <w:pPr>
+        <w:ind w:left="1080" w:hanging="1080"/>
+      </w:pPr>
+      <w:rPr>
+        <w:rFonts w:hint="default"/>
+      </w:rPr>
+    </w:lvl>
+    <w:lvl w:ilvl="6">
+      <w:start w:val="1"/>
+      <w:numFmt w:val="decimal"/>
+      <w:lvlText w:val="%1.%2.%3.%4.%5.%6.%7."/>
+      <w:lvlJc w:val="left"/>
+      <w:pPr>
+        <w:ind w:left="1440" w:hanging="1440"/>
+      </w:pPr>
+      <w:rPr>
+        <w:rFonts w:hint="default"/>
+      </w:rPr>
+    </w:lvl>
+    <w:lvl w:ilvl="7">
+      <w:start w:val="1"/>
+      <w:numFmt w:val="decimal"/>
+      <w:lvlText w:val="%1.%2.%3.%4.%5.%6.%7.%8."/>
+      <w:lvlJc w:val="left"/>
+      <w:pPr>
+        <w:ind w:left="1440" w:hanging="1440"/>
+      </w:pPr>
+      <w:rPr>
+        <w:rFonts w:hint="default"/>
+      </w:rPr>
+    </w:lvl>
+    <w:lvl w:ilvl="8">
+      <w:start w:val="1"/>
+      <w:numFmt w:val="decimal"/>
+      <w:lvlText w:val="%1.%2.%3.%4.%5.%6.%7.%8.%9."/>
+      <w:lvlJc w:val="left"/>
+      <w:pPr>
+        <w:ind w:left="1800" w:hanging="1800"/>
+      </w:pPr>
+      <w:rPr>
+        <w:rFonts w:hint="default"/>
+      </w:rPr>
+    </w:lvl>
+  </w:abstractNum>
+  <w:abstractNum w:abstractNumId="42" w15:restartNumberingAfterBreak="0">
     <w:nsid w:val="51BF57F3"/>
     <w:multiLevelType w:val="hybridMultilevel"/>
     <w:tmpl w:val="A22E30E4"/>
@@ -11311,7 +13006,93 @@
       </w:pPr>
     </w:lvl>
   </w:abstractNum>
-  <w:abstractNum w:abstractNumId="32" w15:restartNumberingAfterBreak="0">
+  <w:abstractNum w:abstractNumId="43" w15:restartNumberingAfterBreak="0">
+    <w:nsid w:val="53AD4927"/>
+    <w:multiLevelType w:val="hybridMultilevel"/>
+    <w:tmpl w:val="37C0246E"/>
+    <w:lvl w:ilvl="0" w:tplc="0409000F">
+      <w:start w:val="1"/>
+      <w:numFmt w:val="decimal"/>
+      <w:lvlText w:val="%1."/>
+      <w:lvlJc w:val="left"/>
+      <w:pPr>
+        <w:ind w:left="360" w:hanging="360"/>
+      </w:pPr>
+    </w:lvl>
+    <w:lvl w:ilvl="1" w:tplc="04090019" w:tentative="1">
+      <w:start w:val="1"/>
+      <w:numFmt w:val="lowerLetter"/>
+      <w:lvlText w:val="%2."/>
+      <w:lvlJc w:val="left"/>
+      <w:pPr>
+        <w:ind w:left="1080" w:hanging="360"/>
+      </w:pPr>
+    </w:lvl>
+    <w:lvl w:ilvl="2" w:tplc="0409001B" w:tentative="1">
+      <w:start w:val="1"/>
+      <w:numFmt w:val="lowerRoman"/>
+      <w:lvlText w:val="%3."/>
+      <w:lvlJc w:val="right"/>
+      <w:pPr>
+        <w:ind w:left="1800" w:hanging="180"/>
+      </w:pPr>
+    </w:lvl>
+    <w:lvl w:ilvl="3" w:tplc="0409000F" w:tentative="1">
+      <w:start w:val="1"/>
+      <w:numFmt w:val="decimal"/>
+      <w:lvlText w:val="%4."/>
+      <w:lvlJc w:val="left"/>
+      <w:pPr>
+        <w:ind w:left="2520" w:hanging="360"/>
+      </w:pPr>
+    </w:lvl>
+    <w:lvl w:ilvl="4" w:tplc="04090019" w:tentative="1">
+      <w:start w:val="1"/>
+      <w:numFmt w:val="lowerLetter"/>
+      <w:lvlText w:val="%5."/>
+      <w:lvlJc w:val="left"/>
+      <w:pPr>
+        <w:ind w:left="3240" w:hanging="360"/>
+      </w:pPr>
+    </w:lvl>
+    <w:lvl w:ilvl="5" w:tplc="0409001B" w:tentative="1">
+      <w:start w:val="1"/>
+      <w:numFmt w:val="lowerRoman"/>
+      <w:lvlText w:val="%6."/>
+      <w:lvlJc w:val="right"/>
+      <w:pPr>
+        <w:ind w:left="3960" w:hanging="180"/>
+      </w:pPr>
+    </w:lvl>
+    <w:lvl w:ilvl="6" w:tplc="0409000F" w:tentative="1">
+      <w:start w:val="1"/>
+      <w:numFmt w:val="decimal"/>
+      <w:lvlText w:val="%7."/>
+      <w:lvlJc w:val="left"/>
+      <w:pPr>
+        <w:ind w:left="4680" w:hanging="360"/>
+      </w:pPr>
+    </w:lvl>
+    <w:lvl w:ilvl="7" w:tplc="04090019" w:tentative="1">
+      <w:start w:val="1"/>
+      <w:numFmt w:val="lowerLetter"/>
+      <w:lvlText w:val="%8."/>
+      <w:lvlJc w:val="left"/>
+      <w:pPr>
+        <w:ind w:left="5400" w:hanging="360"/>
+      </w:pPr>
+    </w:lvl>
+    <w:lvl w:ilvl="8" w:tplc="0409001B" w:tentative="1">
+      <w:start w:val="1"/>
+      <w:numFmt w:val="lowerRoman"/>
+      <w:lvlText w:val="%9."/>
+      <w:lvlJc w:val="right"/>
+      <w:pPr>
+        <w:ind w:left="6120" w:hanging="180"/>
+      </w:pPr>
+    </w:lvl>
+  </w:abstractNum>
+  <w:abstractNum w:abstractNumId="44" w15:restartNumberingAfterBreak="0">
     <w:nsid w:val="53C90C5E"/>
     <w:multiLevelType w:val="hybridMultilevel"/>
     <w:tmpl w:val="3FCABBA8"/>
@@ -11397,7 +13178,7 @@
       </w:pPr>
     </w:lvl>
   </w:abstractNum>
-  <w:abstractNum w:abstractNumId="33" w15:restartNumberingAfterBreak="0">
+  <w:abstractNum w:abstractNumId="45" w15:restartNumberingAfterBreak="0">
     <w:nsid w:val="55457631"/>
     <w:multiLevelType w:val="hybridMultilevel"/>
     <w:tmpl w:val="C6B0FEC4"/>
@@ -11486,7 +13267,7 @@
       </w:pPr>
     </w:lvl>
   </w:abstractNum>
-  <w:abstractNum w:abstractNumId="34" w15:restartNumberingAfterBreak="0">
+  <w:abstractNum w:abstractNumId="46" w15:restartNumberingAfterBreak="0">
     <w:nsid w:val="5A7751F3"/>
     <w:multiLevelType w:val="hybridMultilevel"/>
     <w:tmpl w:val="5D867946"/>
@@ -11572,7 +13353,7 @@
       </w:pPr>
     </w:lvl>
   </w:abstractNum>
-  <w:abstractNum w:abstractNumId="35" w15:restartNumberingAfterBreak="0">
+  <w:abstractNum w:abstractNumId="47" w15:restartNumberingAfterBreak="0">
     <w:nsid w:val="5D973CF6"/>
     <w:multiLevelType w:val="hybridMultilevel"/>
     <w:tmpl w:val="D12C3DB6"/>
@@ -11658,7 +13439,125 @@
       </w:pPr>
     </w:lvl>
   </w:abstractNum>
-  <w:abstractNum w:abstractNumId="36" w15:restartNumberingAfterBreak="0">
+  <w:abstractNum w:abstractNumId="48" w15:restartNumberingAfterBreak="0">
+    <w:nsid w:val="5E8B369C"/>
+    <w:multiLevelType w:val="multilevel"/>
+    <w:tmpl w:val="EE2827A0"/>
+    <w:lvl w:ilvl="0">
+      <w:start w:val="1"/>
+      <w:numFmt w:val="decimal"/>
+      <w:lvlText w:val="%1."/>
+      <w:lvlJc w:val="left"/>
+      <w:pPr>
+        <w:ind w:left="720" w:hanging="360"/>
+      </w:pPr>
+    </w:lvl>
+    <w:lvl w:ilvl="1">
+      <w:start w:val="1"/>
+      <w:numFmt w:val="decimal"/>
+      <w:isLgl/>
+      <w:lvlText w:val="%1.%2."/>
+      <w:lvlJc w:val="left"/>
+      <w:pPr>
+        <w:ind w:left="720" w:hanging="360"/>
+      </w:pPr>
+      <w:rPr>
+        <w:rFonts w:hint="default"/>
+      </w:rPr>
+    </w:lvl>
+    <w:lvl w:ilvl="2">
+      <w:start w:val="1"/>
+      <w:numFmt w:val="decimal"/>
+      <w:isLgl/>
+      <w:lvlText w:val="%1.%2.%3."/>
+      <w:lvlJc w:val="left"/>
+      <w:pPr>
+        <w:ind w:left="1080" w:hanging="720"/>
+      </w:pPr>
+      <w:rPr>
+        <w:rFonts w:hint="default"/>
+      </w:rPr>
+    </w:lvl>
+    <w:lvl w:ilvl="3">
+      <w:start w:val="1"/>
+      <w:numFmt w:val="decimal"/>
+      <w:isLgl/>
+      <w:lvlText w:val="%1.%2.%3.%4."/>
+      <w:lvlJc w:val="left"/>
+      <w:pPr>
+        <w:ind w:left="1080" w:hanging="720"/>
+      </w:pPr>
+      <w:rPr>
+        <w:rFonts w:hint="default"/>
+      </w:rPr>
+    </w:lvl>
+    <w:lvl w:ilvl="4">
+      <w:start w:val="1"/>
+      <w:numFmt w:val="decimal"/>
+      <w:isLgl/>
+      <w:lvlText w:val="%1.%2.%3.%4.%5."/>
+      <w:lvlJc w:val="left"/>
+      <w:pPr>
+        <w:ind w:left="1440" w:hanging="1080"/>
+      </w:pPr>
+      <w:rPr>
+        <w:rFonts w:hint="default"/>
+      </w:rPr>
+    </w:lvl>
+    <w:lvl w:ilvl="5">
+      <w:start w:val="1"/>
+      <w:numFmt w:val="decimal"/>
+      <w:isLgl/>
+      <w:lvlText w:val="%1.%2.%3.%4.%5.%6."/>
+      <w:lvlJc w:val="left"/>
+      <w:pPr>
+        <w:ind w:left="1440" w:hanging="1080"/>
+      </w:pPr>
+      <w:rPr>
+        <w:rFonts w:hint="default"/>
+      </w:rPr>
+    </w:lvl>
+    <w:lvl w:ilvl="6">
+      <w:start w:val="1"/>
+      <w:numFmt w:val="decimal"/>
+      <w:isLgl/>
+      <w:lvlText w:val="%1.%2.%3.%4.%5.%6.%7."/>
+      <w:lvlJc w:val="left"/>
+      <w:pPr>
+        <w:ind w:left="1800" w:hanging="1440"/>
+      </w:pPr>
+      <w:rPr>
+        <w:rFonts w:hint="default"/>
+      </w:rPr>
+    </w:lvl>
+    <w:lvl w:ilvl="7">
+      <w:start w:val="1"/>
+      <w:numFmt w:val="decimal"/>
+      <w:isLgl/>
+      <w:lvlText w:val="%1.%2.%3.%4.%5.%6.%7.%8."/>
+      <w:lvlJc w:val="left"/>
+      <w:pPr>
+        <w:ind w:left="1800" w:hanging="1440"/>
+      </w:pPr>
+      <w:rPr>
+        <w:rFonts w:hint="default"/>
+      </w:rPr>
+    </w:lvl>
+    <w:lvl w:ilvl="8">
+      <w:start w:val="1"/>
+      <w:numFmt w:val="decimal"/>
+      <w:isLgl/>
+      <w:lvlText w:val="%1.%2.%3.%4.%5.%6.%7.%8.%9."/>
+      <w:lvlJc w:val="left"/>
+      <w:pPr>
+        <w:ind w:left="2160" w:hanging="1800"/>
+      </w:pPr>
+      <w:rPr>
+        <w:rFonts w:hint="default"/>
+      </w:rPr>
+    </w:lvl>
+  </w:abstractNum>
+  <w:abstractNum w:abstractNumId="49" w15:restartNumberingAfterBreak="0">
     <w:nsid w:val="6148462C"/>
     <w:multiLevelType w:val="hybridMultilevel"/>
     <w:tmpl w:val="B2AACA52"/>
@@ -11744,7 +13643,7 @@
       </w:pPr>
     </w:lvl>
   </w:abstractNum>
-  <w:abstractNum w:abstractNumId="37" w15:restartNumberingAfterBreak="0">
+  <w:abstractNum w:abstractNumId="50" w15:restartNumberingAfterBreak="0">
     <w:nsid w:val="61926181"/>
     <w:multiLevelType w:val="hybridMultilevel"/>
     <w:tmpl w:val="1DC098F6"/>
@@ -11834,7 +13733,7 @@
       </w:pPr>
     </w:lvl>
   </w:abstractNum>
-  <w:abstractNum w:abstractNumId="38" w15:restartNumberingAfterBreak="0">
+  <w:abstractNum w:abstractNumId="51" w15:restartNumberingAfterBreak="0">
     <w:nsid w:val="621E5766"/>
     <w:multiLevelType w:val="hybridMultilevel"/>
     <w:tmpl w:val="6E8C5AFE"/>
@@ -11920,7 +13819,7 @@
       </w:pPr>
     </w:lvl>
   </w:abstractNum>
-  <w:abstractNum w:abstractNumId="39" w15:restartNumberingAfterBreak="0">
+  <w:abstractNum w:abstractNumId="52" w15:restartNumberingAfterBreak="0">
     <w:nsid w:val="623A28A4"/>
     <w:multiLevelType w:val="hybridMultilevel"/>
     <w:tmpl w:val="D1147A0E"/>
@@ -12006,7 +13905,7 @@
       </w:pPr>
     </w:lvl>
   </w:abstractNum>
-  <w:abstractNum w:abstractNumId="40" w15:restartNumberingAfterBreak="0">
+  <w:abstractNum w:abstractNumId="53" w15:restartNumberingAfterBreak="0">
     <w:nsid w:val="62C2789D"/>
     <w:multiLevelType w:val="hybridMultilevel"/>
     <w:tmpl w:val="1FF20C84"/>
@@ -12095,7 +13994,7 @@
       </w:pPr>
     </w:lvl>
   </w:abstractNum>
-  <w:abstractNum w:abstractNumId="41" w15:restartNumberingAfterBreak="0">
+  <w:abstractNum w:abstractNumId="54" w15:restartNumberingAfterBreak="0">
     <w:nsid w:val="63644B48"/>
     <w:multiLevelType w:val="hybridMultilevel"/>
     <w:tmpl w:val="8A44CCF6"/>
@@ -12181,7 +14080,7 @@
       </w:pPr>
     </w:lvl>
   </w:abstractNum>
-  <w:abstractNum w:abstractNumId="42" w15:restartNumberingAfterBreak="0">
+  <w:abstractNum w:abstractNumId="55" w15:restartNumberingAfterBreak="0">
     <w:nsid w:val="6CCB07A9"/>
     <w:multiLevelType w:val="hybridMultilevel"/>
     <w:tmpl w:val="7F489594"/>
@@ -12267,7 +14166,7 @@
       </w:pPr>
     </w:lvl>
   </w:abstractNum>
-  <w:abstractNum w:abstractNumId="43" w15:restartNumberingAfterBreak="0">
+  <w:abstractNum w:abstractNumId="56" w15:restartNumberingAfterBreak="0">
     <w:nsid w:val="76CF2E63"/>
     <w:multiLevelType w:val="hybridMultilevel"/>
     <w:tmpl w:val="D598A19C"/>
@@ -12356,7 +14255,7 @@
       </w:pPr>
     </w:lvl>
   </w:abstractNum>
-  <w:abstractNum w:abstractNumId="44" w15:restartNumberingAfterBreak="0">
+  <w:abstractNum w:abstractNumId="57" w15:restartNumberingAfterBreak="0">
     <w:nsid w:val="77B22B64"/>
     <w:multiLevelType w:val="hybridMultilevel"/>
     <w:tmpl w:val="9DDEE146"/>
@@ -12442,7 +14341,7 @@
       </w:pPr>
     </w:lvl>
   </w:abstractNum>
-  <w:abstractNum w:abstractNumId="45" w15:restartNumberingAfterBreak="0">
+  <w:abstractNum w:abstractNumId="58" w15:restartNumberingAfterBreak="0">
     <w:nsid w:val="7C064C95"/>
     <w:multiLevelType w:val="hybridMultilevel"/>
     <w:tmpl w:val="44BEBB7E"/>
@@ -12532,7 +14431,7 @@
       </w:pPr>
     </w:lvl>
   </w:abstractNum>
-  <w:abstractNum w:abstractNumId="46" w15:restartNumberingAfterBreak="0">
+  <w:abstractNum w:abstractNumId="59" w15:restartNumberingAfterBreak="0">
     <w:nsid w:val="7C6D277D"/>
     <w:multiLevelType w:val="hybridMultilevel"/>
     <w:tmpl w:val="1C66D54C"/>
@@ -12618,7 +14517,7 @@
       </w:pPr>
     </w:lvl>
   </w:abstractNum>
-  <w:abstractNum w:abstractNumId="47" w15:restartNumberingAfterBreak="0">
+  <w:abstractNum w:abstractNumId="60" w15:restartNumberingAfterBreak="0">
     <w:nsid w:val="7D296E26"/>
     <w:multiLevelType w:val="hybridMultilevel"/>
     <w:tmpl w:val="097649E8"/>
@@ -12705,10 +14604,10 @@
     </w:lvl>
   </w:abstractNum>
   <w:num w:numId="1" w16cid:durableId="716785033">
-    <w:abstractNumId w:val="40"/>
+    <w:abstractNumId w:val="53"/>
   </w:num>
   <w:num w:numId="2" w16cid:durableId="4476494">
-    <w:abstractNumId w:val="29"/>
+    <w:abstractNumId w:val="39"/>
   </w:num>
   <w:num w:numId="3" w16cid:durableId="1589196386">
     <w:abstractNumId w:val="1"/>
@@ -12717,136 +14616,175 @@
     <w:abstractNumId w:val="2"/>
   </w:num>
   <w:num w:numId="5" w16cid:durableId="253711904">
-    <w:abstractNumId w:val="31"/>
+    <w:abstractNumId w:val="42"/>
   </w:num>
   <w:num w:numId="6" w16cid:durableId="451942077">
+    <w:abstractNumId w:val="11"/>
+  </w:num>
+  <w:num w:numId="7" w16cid:durableId="738668746">
+    <w:abstractNumId w:val="45"/>
+  </w:num>
+  <w:num w:numId="8" w16cid:durableId="1120148764">
+    <w:abstractNumId w:val="56"/>
+  </w:num>
+  <w:num w:numId="9" w16cid:durableId="706831956">
+    <w:abstractNumId w:val="51"/>
+  </w:num>
+  <w:num w:numId="10" w16cid:durableId="1092774798">
     <w:abstractNumId w:val="8"/>
   </w:num>
-  <w:num w:numId="7" w16cid:durableId="738668746">
-    <w:abstractNumId w:val="33"/>
-  </w:num>
-  <w:num w:numId="8" w16cid:durableId="1120148764">
-    <w:abstractNumId w:val="43"/>
-  </w:num>
-  <w:num w:numId="9" w16cid:durableId="706831956">
-    <w:abstractNumId w:val="38"/>
-  </w:num>
-  <w:num w:numId="10" w16cid:durableId="1092774798">
-    <w:abstractNumId w:val="5"/>
-  </w:num>
   <w:num w:numId="11" w16cid:durableId="1084766776">
-    <w:abstractNumId w:val="14"/>
+    <w:abstractNumId w:val="20"/>
   </w:num>
   <w:num w:numId="12" w16cid:durableId="1196504042">
-    <w:abstractNumId w:val="22"/>
+    <w:abstractNumId w:val="30"/>
   </w:num>
   <w:num w:numId="13" w16cid:durableId="406922002">
     <w:abstractNumId w:val="0"/>
   </w:num>
   <w:num w:numId="14" w16cid:durableId="2059355694">
-    <w:abstractNumId w:val="30"/>
+    <w:abstractNumId w:val="40"/>
   </w:num>
   <w:num w:numId="15" w16cid:durableId="22101003">
+    <w:abstractNumId w:val="25"/>
+  </w:num>
+  <w:num w:numId="16" w16cid:durableId="1488133867">
+    <w:abstractNumId w:val="50"/>
+  </w:num>
+  <w:num w:numId="17" w16cid:durableId="1316497591">
+    <w:abstractNumId w:val="24"/>
+  </w:num>
+  <w:num w:numId="18" w16cid:durableId="141427833">
+    <w:abstractNumId w:val="7"/>
+  </w:num>
+  <w:num w:numId="19" w16cid:durableId="2069918383">
+    <w:abstractNumId w:val="58"/>
+  </w:num>
+  <w:num w:numId="20" w16cid:durableId="2009550357">
+    <w:abstractNumId w:val="33"/>
+  </w:num>
+  <w:num w:numId="21" w16cid:durableId="2057506181">
+    <w:abstractNumId w:val="49"/>
+  </w:num>
+  <w:num w:numId="22" w16cid:durableId="1230849346">
+    <w:abstractNumId w:val="22"/>
+  </w:num>
+  <w:num w:numId="23" w16cid:durableId="53049550">
+    <w:abstractNumId w:val="26"/>
+  </w:num>
+  <w:num w:numId="24" w16cid:durableId="1324773439">
+    <w:abstractNumId w:val="55"/>
+  </w:num>
+  <w:num w:numId="25" w16cid:durableId="713118493">
+    <w:abstractNumId w:val="59"/>
+  </w:num>
+  <w:num w:numId="26" w16cid:durableId="1672873457">
+    <w:abstractNumId w:val="14"/>
+  </w:num>
+  <w:num w:numId="27" w16cid:durableId="295717551">
+    <w:abstractNumId w:val="37"/>
+  </w:num>
+  <w:num w:numId="28" w16cid:durableId="1732339784">
+    <w:abstractNumId w:val="44"/>
+  </w:num>
+  <w:num w:numId="29" w16cid:durableId="1186409949">
+    <w:abstractNumId w:val="32"/>
+  </w:num>
+  <w:num w:numId="30" w16cid:durableId="1152328811">
+    <w:abstractNumId w:val="47"/>
+  </w:num>
+  <w:num w:numId="31" w16cid:durableId="1038316160">
+    <w:abstractNumId w:val="54"/>
+  </w:num>
+  <w:num w:numId="32" w16cid:durableId="127363660">
+    <w:abstractNumId w:val="46"/>
+  </w:num>
+  <w:num w:numId="33" w16cid:durableId="474763762">
+    <w:abstractNumId w:val="57"/>
+  </w:num>
+  <w:num w:numId="34" w16cid:durableId="1252474577">
+    <w:abstractNumId w:val="23"/>
+  </w:num>
+  <w:num w:numId="35" w16cid:durableId="575089617">
+    <w:abstractNumId w:val="10"/>
+  </w:num>
+  <w:num w:numId="36" w16cid:durableId="1103695054">
+    <w:abstractNumId w:val="60"/>
+  </w:num>
+  <w:num w:numId="37" w16cid:durableId="810636004">
+    <w:abstractNumId w:val="27"/>
+  </w:num>
+  <w:num w:numId="38" w16cid:durableId="764038668">
+    <w:abstractNumId w:val="29"/>
+  </w:num>
+  <w:num w:numId="39" w16cid:durableId="619192541">
+    <w:abstractNumId w:val="38"/>
+  </w:num>
+  <w:num w:numId="40" w16cid:durableId="1425803600">
+    <w:abstractNumId w:val="9"/>
+  </w:num>
+  <w:num w:numId="41" w16cid:durableId="380446402">
+    <w:abstractNumId w:val="4"/>
+  </w:num>
+  <w:num w:numId="42" w16cid:durableId="169681073">
+    <w:abstractNumId w:val="15"/>
+  </w:num>
+  <w:num w:numId="43" w16cid:durableId="2085443387">
+    <w:abstractNumId w:val="31"/>
+  </w:num>
+  <w:num w:numId="44" w16cid:durableId="1401171856">
+    <w:abstractNumId w:val="52"/>
+  </w:num>
+  <w:num w:numId="45" w16cid:durableId="2131168016">
+    <w:abstractNumId w:val="17"/>
+  </w:num>
+  <w:num w:numId="46" w16cid:durableId="1590574422">
+    <w:abstractNumId w:val="35"/>
+  </w:num>
+  <w:num w:numId="47" w16cid:durableId="1620800185">
+    <w:abstractNumId w:val="16"/>
+  </w:num>
+  <w:num w:numId="48" w16cid:durableId="463960494">
+    <w:abstractNumId w:val="19"/>
+  </w:num>
+  <w:num w:numId="49" w16cid:durableId="236135513">
+    <w:abstractNumId w:val="43"/>
+  </w:num>
+  <w:num w:numId="50" w16cid:durableId="2140831517">
+    <w:abstractNumId w:val="5"/>
+  </w:num>
+  <w:num w:numId="51" w16cid:durableId="1370690074">
+    <w:abstractNumId w:val="41"/>
+  </w:num>
+  <w:num w:numId="52" w16cid:durableId="448819157">
     <w:abstractNumId w:val="18"/>
   </w:num>
-  <w:num w:numId="16" w16cid:durableId="1488133867">
-    <w:abstractNumId w:val="37"/>
+  <w:num w:numId="53" w16cid:durableId="1124039045">
+    <w:abstractNumId w:val="34"/>
   </w:num>
-  <w:num w:numId="17" w16cid:durableId="1316497591">
-    <w:abstractNumId w:val="17"/>
+  <w:num w:numId="54" w16cid:durableId="1942301745">
+    <w:abstractNumId w:val="13"/>
   </w:num>
-  <w:num w:numId="18" w16cid:durableId="141427833">
-    <w:abstractNumId w:val="4"/>
+  <w:num w:numId="55" w16cid:durableId="125205291">
+    <w:abstractNumId w:val="28"/>
   </w:num>
-  <w:num w:numId="19" w16cid:durableId="2069918383">
-    <w:abstractNumId w:val="45"/>
+  <w:num w:numId="56" w16cid:durableId="1549954003">
+    <w:abstractNumId w:val="48"/>
   </w:num>
-  <w:num w:numId="20" w16cid:durableId="2009550357">
-    <w:abstractNumId w:val="25"/>
-  </w:num>
-  <w:num w:numId="21" w16cid:durableId="2057506181">
+  <w:num w:numId="57" w16cid:durableId="1407998235">
     <w:abstractNumId w:val="36"/>
   </w:num>
-  <w:num w:numId="22" w16cid:durableId="1230849346">
-    <w:abstractNumId w:val="15"/>
-  </w:num>
-  <w:num w:numId="23" w16cid:durableId="53049550">
-    <w:abstractNumId w:val="19"/>
-  </w:num>
-  <w:num w:numId="24" w16cid:durableId="1324773439">
-    <w:abstractNumId w:val="42"/>
-  </w:num>
-  <w:num w:numId="25" w16cid:durableId="713118493">
-    <w:abstractNumId w:val="46"/>
-  </w:num>
-  <w:num w:numId="26" w16cid:durableId="1672873457">
-    <w:abstractNumId w:val="9"/>
-  </w:num>
-  <w:num w:numId="27" w16cid:durableId="295717551">
-    <w:abstractNumId w:val="27"/>
-  </w:num>
-  <w:num w:numId="28" w16cid:durableId="1732339784">
-    <w:abstractNumId w:val="32"/>
-  </w:num>
-  <w:num w:numId="29" w16cid:durableId="1186409949">
-    <w:abstractNumId w:val="24"/>
-  </w:num>
-  <w:num w:numId="30" w16cid:durableId="1152328811">
-    <w:abstractNumId w:val="35"/>
-  </w:num>
-  <w:num w:numId="31" w16cid:durableId="1038316160">
-    <w:abstractNumId w:val="41"/>
-  </w:num>
-  <w:num w:numId="32" w16cid:durableId="127363660">
-    <w:abstractNumId w:val="34"/>
-  </w:num>
-  <w:num w:numId="33" w16cid:durableId="474763762">
-    <w:abstractNumId w:val="44"/>
-  </w:num>
-  <w:num w:numId="34" w16cid:durableId="1252474577">
-    <w:abstractNumId w:val="16"/>
-  </w:num>
-  <w:num w:numId="35" w16cid:durableId="575089617">
-    <w:abstractNumId w:val="7"/>
-  </w:num>
-  <w:num w:numId="36" w16cid:durableId="1103695054">
-    <w:abstractNumId w:val="47"/>
-  </w:num>
-  <w:num w:numId="37" w16cid:durableId="810636004">
-    <w:abstractNumId w:val="20"/>
-  </w:num>
-  <w:num w:numId="38" w16cid:durableId="764038668">
-    <w:abstractNumId w:val="21"/>
-  </w:num>
-  <w:num w:numId="39" w16cid:durableId="619192541">
-    <w:abstractNumId w:val="28"/>
-  </w:num>
-  <w:num w:numId="40" w16cid:durableId="1425803600">
+  <w:num w:numId="58" w16cid:durableId="983513020">
     <w:abstractNumId w:val="6"/>
   </w:num>
-  <w:num w:numId="41" w16cid:durableId="380446402">
+  <w:num w:numId="59" w16cid:durableId="669482803">
     <w:abstractNumId w:val="3"/>
   </w:num>
-  <w:num w:numId="42" w16cid:durableId="169681073">
-    <w:abstractNumId w:val="10"/>
-  </w:num>
-  <w:num w:numId="43" w16cid:durableId="2085443387">
-    <w:abstractNumId w:val="23"/>
-  </w:num>
-  <w:num w:numId="44" w16cid:durableId="1401171856">
-    <w:abstractNumId w:val="39"/>
-  </w:num>
-  <w:num w:numId="45" w16cid:durableId="2131168016">
+  <w:num w:numId="60" w16cid:durableId="1372799541">
     <w:abstractNumId w:val="12"/>
   </w:num>
-  <w:num w:numId="46" w16cid:durableId="1590574422">
-    <w:abstractNumId w:val="26"/>
-  </w:num>
-  <w:num w:numId="47" w16cid:durableId="1620800185">
-    <w:abstractNumId w:val="11"/>
-  </w:num>
-  <w:num w:numId="48" w16cid:durableId="463960494">
-    <w:abstractNumId w:val="13"/>
+  <w:num w:numId="61" w16cid:durableId="1297102901">
+    <w:abstractNumId w:val="21"/>
   </w:num>
 </w:numbering>
 </file>

</xml_diff>